<commit_message>
fix: Complete coding manual with full variable coverage for all 9 sheets
- Section 6: Add variable-by-variable table for all 35 EFFECT_SIZES variables
  (linking, sample, outcome classification, raw statistics, alternative stats,
  calculated ES, source tracking, source management)
- Section 7: Add complete 12-variable table for RAW_EXTRACTION with
  extraction_id format (S###_E##_X##) and variable_extracted rules
- Section 12 (NEW): Study Exclusion Protocol — 10-variable table for
  EXCLUSION_LOG with screening decision documentation
- Section 13 (NEW): Database Search Protocol — 5-variable table for
  SEARCH_LOG with PRISMA 2020 documentation requirements
- Sections renumbered: QA Checklist → 14, References → 15
- TOC updated to reflect 15 sections + 3 appendices

All 144 variables across 9 Excel sheets are now fully documented.

Co-Authored-By: Claude Opus 4.6 <noreply@anthropic.com>
</commit_message>
<xml_diff>
--- a/docs/GenAI_MetaAnalysis_Coding_Manual_v10.docx
+++ b/docs/GenAI_MetaAnalysis_Coding_Manual_v10.docx
@@ -172,7 +172,7 @@
         <w:pStyle w:val="ListBullet"/>
       </w:pPr>
       <w:r>
-        <w:t>12. Quality Assurance Checklist</w:t>
+        <w:t>12. Study Exclusion Protocol (EXCLUSION_LOG)</w:t>
       </w:r>
     </w:p>
     <w:p>
@@ -180,7 +180,23 @@
         <w:pStyle w:val="ListBullet"/>
       </w:pPr>
       <w:r>
-        <w:t>13. References</w:t>
+        <w:t>13. Database Search Protocol (SEARCH_LOG)</w:t>
+      </w:r>
+    </w:p>
+    <w:p>
+      <w:pPr>
+        <w:pStyle w:val="ListBullet"/>
+      </w:pPr>
+      <w:r>
+        <w:t>14. Quality Assurance Checklist</w:t>
+      </w:r>
+    </w:p>
+    <w:p>
+      <w:pPr>
+        <w:pStyle w:val="ListBullet"/>
+      </w:pPr>
+      <w:r>
+        <w:t>15. References</w:t>
       </w:r>
     </w:p>
     <w:p>
@@ -4172,7 +4188,2769 @@
         <w:pStyle w:val="Heading2"/>
       </w:pPr>
       <w:r>
-        <w:t>6.1 Effect Size Identification</w:t>
+        <w:t>6.1 Complete Variable Reference (35 variables)</w:t>
+      </w:r>
+    </w:p>
+    <w:p>
+      <w:r>
+        <w:t>The following tables list every variable in the EFFECT_SIZES sheet with operational definitions and coding rules. Detailed guidance for complex variables follows in subsequent subsections.</w:t>
+      </w:r>
+    </w:p>
+    <w:p>
+      <w:pPr>
+        <w:pStyle w:val="Heading3"/>
+      </w:pPr>
+      <w:r>
+        <w:t>Linking Variables (3)</w:t>
+      </w:r>
+    </w:p>
+    <w:tbl>
+      <w:tblPr>
+        <w:tblW w:type="auto" w:w="0"/>
+        <w:jc w:val="center"/>
+        <w:tblLook w:firstColumn="1" w:firstRow="1" w:lastColumn="0" w:lastRow="0" w:noHBand="0" w:noVBand="1" w:val="04A0"/>
+      </w:tblPr>
+      <w:tblGrid>
+        <w:gridCol w:w="2160"/>
+        <w:gridCol w:w="2160"/>
+        <w:gridCol w:w="2160"/>
+        <w:gridCol w:w="2160"/>
+      </w:tblGrid>
+      <w:tr>
+        <w:tc>
+          <w:tcPr>
+            <w:tcW w:type="dxa" w:w="2160"/>
+            <w:shd w:fill="1F4E79"/>
+          </w:tcPr>
+          <w:p>
+            <w:r>
+              <w:rPr>
+                <w:b/>
+                <w:color w:val="FFFFFF"/>
+                <w:sz w:val="20"/>
+              </w:rPr>
+              <w:t>Variable</w:t>
+            </w:r>
+          </w:p>
+        </w:tc>
+        <w:tc>
+          <w:tcPr>
+            <w:tcW w:type="dxa" w:w="2160"/>
+            <w:shd w:fill="1F4E79"/>
+          </w:tcPr>
+          <w:p>
+            <w:r>
+              <w:rPr>
+                <w:b/>
+                <w:color w:val="FFFFFF"/>
+                <w:sz w:val="20"/>
+              </w:rPr>
+              <w:t>Type</w:t>
+            </w:r>
+          </w:p>
+        </w:tc>
+        <w:tc>
+          <w:tcPr>
+            <w:tcW w:type="dxa" w:w="2160"/>
+            <w:shd w:fill="1F4E79"/>
+          </w:tcPr>
+          <w:p>
+            <w:r>
+              <w:rPr>
+                <w:b/>
+                <w:color w:val="FFFFFF"/>
+                <w:sz w:val="20"/>
+              </w:rPr>
+              <w:t>Definition &amp; Rules</w:t>
+            </w:r>
+          </w:p>
+        </w:tc>
+        <w:tc>
+          <w:tcPr>
+            <w:tcW w:type="dxa" w:w="2160"/>
+            <w:shd w:fill="1F4E79"/>
+          </w:tcPr>
+          <w:p>
+            <w:r>
+              <w:rPr>
+                <w:b/>
+                <w:color w:val="FFFFFF"/>
+                <w:sz w:val="20"/>
+              </w:rPr>
+              <w:t>Example</w:t>
+            </w:r>
+          </w:p>
+        </w:tc>
+      </w:tr>
+      <w:tr>
+        <w:tc>
+          <w:tcPr>
+            <w:tcW w:type="dxa" w:w="2160"/>
+            <w:shd w:fill="D9E2F3"/>
+          </w:tcPr>
+          <w:p>
+            <w:r>
+              <w:rPr>
+                <w:sz w:val="20"/>
+              </w:rPr>
+              <w:t>study_id</w:t>
+            </w:r>
+          </w:p>
+        </w:tc>
+        <w:tc>
+          <w:tcPr>
+            <w:tcW w:type="dxa" w:w="2160"/>
+            <w:shd w:fill="D9E2F3"/>
+          </w:tcPr>
+          <w:p>
+            <w:r>
+              <w:rPr>
+                <w:sz w:val="20"/>
+              </w:rPr>
+              <w:t>Integer</w:t>
+            </w:r>
+          </w:p>
+        </w:tc>
+        <w:tc>
+          <w:tcPr>
+            <w:tcW w:type="dxa" w:w="2160"/>
+            <w:shd w:fill="D9E2F3"/>
+          </w:tcPr>
+          <w:p>
+            <w:r>
+              <w:rPr>
+                <w:sz w:val="20"/>
+              </w:rPr>
+              <w:t>Must match study_id in STUDY_CHAR.</w:t>
+            </w:r>
+          </w:p>
+        </w:tc>
+        <w:tc>
+          <w:tcPr>
+            <w:tcW w:type="dxa" w:w="2160"/>
+            <w:shd w:fill="D9E2F3"/>
+          </w:tcPr>
+          <w:p>
+            <w:r>
+              <w:rPr>
+                <w:sz w:val="20"/>
+              </w:rPr>
+              <w:t>1</w:t>
+            </w:r>
+          </w:p>
+        </w:tc>
+      </w:tr>
+      <w:tr>
+        <w:tc>
+          <w:tcPr>
+            <w:tcW w:type="dxa" w:w="2160"/>
+          </w:tcPr>
+          <w:p>
+            <w:r>
+              <w:rPr>
+                <w:sz w:val="20"/>
+              </w:rPr>
+              <w:t>es_id</w:t>
+            </w:r>
+          </w:p>
+        </w:tc>
+        <w:tc>
+          <w:tcPr>
+            <w:tcW w:type="dxa" w:w="2160"/>
+          </w:tcPr>
+          <w:p>
+            <w:r>
+              <w:rPr>
+                <w:sz w:val="20"/>
+              </w:rPr>
+              <w:t>String</w:t>
+            </w:r>
+          </w:p>
+        </w:tc>
+        <w:tc>
+          <w:tcPr>
+            <w:tcW w:type="dxa" w:w="2160"/>
+          </w:tcPr>
+          <w:p>
+            <w:r>
+              <w:rPr>
+                <w:sz w:val="20"/>
+              </w:rPr>
+              <w:t>Format: S###_E## where ### = zero-padded study_id, ## = effect size number.</w:t>
+            </w:r>
+          </w:p>
+        </w:tc>
+        <w:tc>
+          <w:tcPr>
+            <w:tcW w:type="dxa" w:w="2160"/>
+          </w:tcPr>
+          <w:p>
+            <w:r>
+              <w:rPr>
+                <w:sz w:val="20"/>
+              </w:rPr>
+              <w:t>S001_E01</w:t>
+            </w:r>
+          </w:p>
+        </w:tc>
+      </w:tr>
+      <w:tr>
+        <w:tc>
+          <w:tcPr>
+            <w:tcW w:type="dxa" w:w="2160"/>
+            <w:shd w:fill="D9E2F3"/>
+          </w:tcPr>
+          <w:p>
+            <w:r>
+              <w:rPr>
+                <w:sz w:val="20"/>
+              </w:rPr>
+              <w:t>es_sequence</w:t>
+            </w:r>
+          </w:p>
+        </w:tc>
+        <w:tc>
+          <w:tcPr>
+            <w:tcW w:type="dxa" w:w="2160"/>
+            <w:shd w:fill="D9E2F3"/>
+          </w:tcPr>
+          <w:p>
+            <w:r>
+              <w:rPr>
+                <w:sz w:val="20"/>
+              </w:rPr>
+              <w:t>Integer</w:t>
+            </w:r>
+          </w:p>
+        </w:tc>
+        <w:tc>
+          <w:tcPr>
+            <w:tcW w:type="dxa" w:w="2160"/>
+            <w:shd w:fill="D9E2F3"/>
+          </w:tcPr>
+          <w:p>
+            <w:r>
+              <w:rPr>
+                <w:sz w:val="20"/>
+              </w:rPr>
+              <w:t>Ordinal position of this effect size within the study (1, 2, 3, ...).</w:t>
+            </w:r>
+          </w:p>
+        </w:tc>
+        <w:tc>
+          <w:tcPr>
+            <w:tcW w:type="dxa" w:w="2160"/>
+            <w:shd w:fill="D9E2F3"/>
+          </w:tcPr>
+          <w:p>
+            <w:r>
+              <w:rPr>
+                <w:sz w:val="20"/>
+              </w:rPr>
+              <w:t>1</w:t>
+            </w:r>
+          </w:p>
+        </w:tc>
+      </w:tr>
+    </w:tbl>
+    <w:p>
+      <w:pPr>
+        <w:pStyle w:val="Heading3"/>
+      </w:pPr>
+      <w:r>
+        <w:t>Sample — Effect Size Level (2)</w:t>
+      </w:r>
+    </w:p>
+    <w:tbl>
+      <w:tblPr>
+        <w:tblW w:type="auto" w:w="0"/>
+        <w:jc w:val="center"/>
+        <w:tblLook w:firstColumn="1" w:firstRow="1" w:lastColumn="0" w:lastRow="0" w:noHBand="0" w:noVBand="1" w:val="04A0"/>
+      </w:tblPr>
+      <w:tblGrid>
+        <w:gridCol w:w="2160"/>
+        <w:gridCol w:w="2160"/>
+        <w:gridCol w:w="2160"/>
+        <w:gridCol w:w="2160"/>
+      </w:tblGrid>
+      <w:tr>
+        <w:tc>
+          <w:tcPr>
+            <w:tcW w:type="dxa" w:w="2160"/>
+            <w:shd w:fill="1F4E79"/>
+          </w:tcPr>
+          <w:p>
+            <w:r>
+              <w:rPr>
+                <w:b/>
+                <w:color w:val="FFFFFF"/>
+                <w:sz w:val="20"/>
+              </w:rPr>
+              <w:t>Variable</w:t>
+            </w:r>
+          </w:p>
+        </w:tc>
+        <w:tc>
+          <w:tcPr>
+            <w:tcW w:type="dxa" w:w="2160"/>
+            <w:shd w:fill="1F4E79"/>
+          </w:tcPr>
+          <w:p>
+            <w:r>
+              <w:rPr>
+                <w:b/>
+                <w:color w:val="FFFFFF"/>
+                <w:sz w:val="20"/>
+              </w:rPr>
+              <w:t>Type</w:t>
+            </w:r>
+          </w:p>
+        </w:tc>
+        <w:tc>
+          <w:tcPr>
+            <w:tcW w:type="dxa" w:w="2160"/>
+            <w:shd w:fill="1F4E79"/>
+          </w:tcPr>
+          <w:p>
+            <w:r>
+              <w:rPr>
+                <w:b/>
+                <w:color w:val="FFFFFF"/>
+                <w:sz w:val="20"/>
+              </w:rPr>
+              <w:t>Definition &amp; Rules</w:t>
+            </w:r>
+          </w:p>
+        </w:tc>
+        <w:tc>
+          <w:tcPr>
+            <w:tcW w:type="dxa" w:w="2160"/>
+            <w:shd w:fill="1F4E79"/>
+          </w:tcPr>
+          <w:p>
+            <w:r>
+              <w:rPr>
+                <w:b/>
+                <w:color w:val="FFFFFF"/>
+                <w:sz w:val="20"/>
+              </w:rPr>
+              <w:t>Example</w:t>
+            </w:r>
+          </w:p>
+        </w:tc>
+      </w:tr>
+      <w:tr>
+        <w:tc>
+          <w:tcPr>
+            <w:tcW w:type="dxa" w:w="2160"/>
+            <w:shd w:fill="D9E2F3"/>
+          </w:tcPr>
+          <w:p>
+            <w:r>
+              <w:rPr>
+                <w:sz w:val="20"/>
+              </w:rPr>
+              <w:t>n_treatment</w:t>
+            </w:r>
+          </w:p>
+        </w:tc>
+        <w:tc>
+          <w:tcPr>
+            <w:tcW w:type="dxa" w:w="2160"/>
+            <w:shd w:fill="D9E2F3"/>
+          </w:tcPr>
+          <w:p>
+            <w:r>
+              <w:rPr>
+                <w:sz w:val="20"/>
+              </w:rPr>
+              <w:t>Integer</w:t>
+            </w:r>
+          </w:p>
+        </w:tc>
+        <w:tc>
+          <w:tcPr>
+            <w:tcW w:type="dxa" w:w="2160"/>
+            <w:shd w:fill="D9E2F3"/>
+          </w:tcPr>
+          <w:p>
+            <w:r>
+              <w:rPr>
+                <w:sz w:val="20"/>
+              </w:rPr>
+              <w:t>Number of participants analyzed in the treatment/GenAI group for THIS outcome. May differ from n_total if study has multiple treatment arms.</w:t>
+            </w:r>
+          </w:p>
+        </w:tc>
+        <w:tc>
+          <w:tcPr>
+            <w:tcW w:type="dxa" w:w="2160"/>
+            <w:shd w:fill="D9E2F3"/>
+          </w:tcPr>
+          <w:p>
+            <w:r>
+              <w:rPr>
+                <w:sz w:val="20"/>
+              </w:rPr>
+              <w:t>45</w:t>
+            </w:r>
+          </w:p>
+        </w:tc>
+      </w:tr>
+      <w:tr>
+        <w:tc>
+          <w:tcPr>
+            <w:tcW w:type="dxa" w:w="2160"/>
+          </w:tcPr>
+          <w:p>
+            <w:r>
+              <w:rPr>
+                <w:sz w:val="20"/>
+              </w:rPr>
+              <w:t>n_control</w:t>
+            </w:r>
+          </w:p>
+        </w:tc>
+        <w:tc>
+          <w:tcPr>
+            <w:tcW w:type="dxa" w:w="2160"/>
+          </w:tcPr>
+          <w:p>
+            <w:r>
+              <w:rPr>
+                <w:sz w:val="20"/>
+              </w:rPr>
+              <w:t>Integer</w:t>
+            </w:r>
+          </w:p>
+        </w:tc>
+        <w:tc>
+          <w:tcPr>
+            <w:tcW w:type="dxa" w:w="2160"/>
+          </w:tcPr>
+          <w:p>
+            <w:r>
+              <w:rPr>
+                <w:sz w:val="20"/>
+              </w:rPr>
+              <w:t>Number of participants analyzed in the control group for THIS outcome. If shared control, divide by number of comparisons.</w:t>
+            </w:r>
+          </w:p>
+        </w:tc>
+        <w:tc>
+          <w:tcPr>
+            <w:tcW w:type="dxa" w:w="2160"/>
+          </w:tcPr>
+          <w:p>
+            <w:r>
+              <w:rPr>
+                <w:sz w:val="20"/>
+              </w:rPr>
+              <w:t>42</w:t>
+            </w:r>
+          </w:p>
+        </w:tc>
+      </w:tr>
+    </w:tbl>
+    <w:p>
+      <w:pPr>
+        <w:pStyle w:val="Heading3"/>
+      </w:pPr>
+      <w:r>
+        <w:t>Outcome Classification (7)</w:t>
+      </w:r>
+    </w:p>
+    <w:tbl>
+      <w:tblPr>
+        <w:tblW w:type="auto" w:w="0"/>
+        <w:jc w:val="center"/>
+        <w:tblLook w:firstColumn="1" w:firstRow="1" w:lastColumn="0" w:lastRow="0" w:noHBand="0" w:noVBand="1" w:val="04A0"/>
+      </w:tblPr>
+      <w:tblGrid>
+        <w:gridCol w:w="2160"/>
+        <w:gridCol w:w="2160"/>
+        <w:gridCol w:w="2160"/>
+        <w:gridCol w:w="2160"/>
+      </w:tblGrid>
+      <w:tr>
+        <w:tc>
+          <w:tcPr>
+            <w:tcW w:type="dxa" w:w="2160"/>
+            <w:shd w:fill="1F4E79"/>
+          </w:tcPr>
+          <w:p>
+            <w:r>
+              <w:rPr>
+                <w:b/>
+                <w:color w:val="FFFFFF"/>
+                <w:sz w:val="20"/>
+              </w:rPr>
+              <w:t>Variable</w:t>
+            </w:r>
+          </w:p>
+        </w:tc>
+        <w:tc>
+          <w:tcPr>
+            <w:tcW w:type="dxa" w:w="2160"/>
+            <w:shd w:fill="1F4E79"/>
+          </w:tcPr>
+          <w:p>
+            <w:r>
+              <w:rPr>
+                <w:b/>
+                <w:color w:val="FFFFFF"/>
+                <w:sz w:val="20"/>
+              </w:rPr>
+              <w:t>Type</w:t>
+            </w:r>
+          </w:p>
+        </w:tc>
+        <w:tc>
+          <w:tcPr>
+            <w:tcW w:type="dxa" w:w="2160"/>
+            <w:shd w:fill="1F4E79"/>
+          </w:tcPr>
+          <w:p>
+            <w:r>
+              <w:rPr>
+                <w:b/>
+                <w:color w:val="FFFFFF"/>
+                <w:sz w:val="20"/>
+              </w:rPr>
+              <w:t>Definition &amp; Rules</w:t>
+            </w:r>
+          </w:p>
+        </w:tc>
+        <w:tc>
+          <w:tcPr>
+            <w:tcW w:type="dxa" w:w="2160"/>
+            <w:shd w:fill="1F4E79"/>
+          </w:tcPr>
+          <w:p>
+            <w:r>
+              <w:rPr>
+                <w:b/>
+                <w:color w:val="FFFFFF"/>
+                <w:sz w:val="20"/>
+              </w:rPr>
+              <w:t>Example</w:t>
+            </w:r>
+          </w:p>
+        </w:tc>
+      </w:tr>
+      <w:tr>
+        <w:tc>
+          <w:tcPr>
+            <w:tcW w:type="dxa" w:w="2160"/>
+            <w:shd w:fill="D9E2F3"/>
+          </w:tcPr>
+          <w:p>
+            <w:r>
+              <w:rPr>
+                <w:sz w:val="20"/>
+              </w:rPr>
+              <w:t>outcome_name</w:t>
+            </w:r>
+          </w:p>
+        </w:tc>
+        <w:tc>
+          <w:tcPr>
+            <w:tcW w:type="dxa" w:w="2160"/>
+            <w:shd w:fill="D9E2F3"/>
+          </w:tcPr>
+          <w:p>
+            <w:r>
+              <w:rPr>
+                <w:sz w:val="20"/>
+              </w:rPr>
+              <w:t>String</w:t>
+            </w:r>
+          </w:p>
+        </w:tc>
+        <w:tc>
+          <w:tcPr>
+            <w:tcW w:type="dxa" w:w="2160"/>
+            <w:shd w:fill="D9E2F3"/>
+          </w:tcPr>
+          <w:p>
+            <w:r>
+              <w:rPr>
+                <w:sz w:val="20"/>
+              </w:rPr>
+              <w:t>Descriptive label for the outcome as named in the study.</w:t>
+            </w:r>
+          </w:p>
+        </w:tc>
+        <w:tc>
+          <w:tcPr>
+            <w:tcW w:type="dxa" w:w="2160"/>
+            <w:shd w:fill="D9E2F3"/>
+          </w:tcPr>
+          <w:p>
+            <w:r>
+              <w:rPr>
+                <w:sz w:val="20"/>
+              </w:rPr>
+              <w:t>Critical thinking score</w:t>
+            </w:r>
+          </w:p>
+        </w:tc>
+      </w:tr>
+      <w:tr>
+        <w:tc>
+          <w:tcPr>
+            <w:tcW w:type="dxa" w:w="2160"/>
+          </w:tcPr>
+          <w:p>
+            <w:r>
+              <w:rPr>
+                <w:sz w:val="20"/>
+              </w:rPr>
+              <w:t>outcome_dimension</w:t>
+            </w:r>
+          </w:p>
+        </w:tc>
+        <w:tc>
+          <w:tcPr>
+            <w:tcW w:type="dxa" w:w="2160"/>
+          </w:tcPr>
+          <w:p>
+            <w:r>
+              <w:rPr>
+                <w:sz w:val="20"/>
+              </w:rPr>
+              <w:t>Categorical</w:t>
+            </w:r>
+          </w:p>
+        </w:tc>
+        <w:tc>
+          <w:tcPr>
+            <w:tcW w:type="dxa" w:w="2160"/>
+          </w:tcPr>
+          <w:p>
+            <w:r>
+              <w:rPr>
+                <w:sz w:val="20"/>
+              </w:rPr>
+              <w:t>cognitive | affective | behavioral | metacognitive. See decision tree in 6.2.</w:t>
+            </w:r>
+          </w:p>
+        </w:tc>
+        <w:tc>
+          <w:tcPr>
+            <w:tcW w:type="dxa" w:w="2160"/>
+          </w:tcPr>
+          <w:p>
+            <w:r>
+              <w:rPr>
+                <w:sz w:val="20"/>
+              </w:rPr>
+              <w:t>cognitive</w:t>
+            </w:r>
+          </w:p>
+        </w:tc>
+      </w:tr>
+      <w:tr>
+        <w:tc>
+          <w:tcPr>
+            <w:tcW w:type="dxa" w:w="2160"/>
+            <w:shd w:fill="D9E2F3"/>
+          </w:tcPr>
+          <w:p>
+            <w:r>
+              <w:rPr>
+                <w:sz w:val="20"/>
+              </w:rPr>
+              <w:t>blooms_level</w:t>
+            </w:r>
+          </w:p>
+        </w:tc>
+        <w:tc>
+          <w:tcPr>
+            <w:tcW w:type="dxa" w:w="2160"/>
+            <w:shd w:fill="D9E2F3"/>
+          </w:tcPr>
+          <w:p>
+            <w:r>
+              <w:rPr>
+                <w:sz w:val="20"/>
+              </w:rPr>
+              <w:t>Categorical</w:t>
+            </w:r>
+          </w:p>
+        </w:tc>
+        <w:tc>
+          <w:tcPr>
+            <w:tcW w:type="dxa" w:w="2160"/>
+            <w:shd w:fill="D9E2F3"/>
+          </w:tcPr>
+          <w:p>
+            <w:r>
+              <w:rPr>
+                <w:sz w:val="20"/>
+              </w:rPr>
+              <w:t>remember | understand | apply | analyze | evaluate | create. See guide in 6.3.</w:t>
+            </w:r>
+          </w:p>
+        </w:tc>
+        <w:tc>
+          <w:tcPr>
+            <w:tcW w:type="dxa" w:w="2160"/>
+            <w:shd w:fill="D9E2F3"/>
+          </w:tcPr>
+          <w:p>
+            <w:r>
+              <w:rPr>
+                <w:sz w:val="20"/>
+              </w:rPr>
+              <w:t>analyze</w:t>
+            </w:r>
+          </w:p>
+        </w:tc>
+      </w:tr>
+      <w:tr>
+        <w:tc>
+          <w:tcPr>
+            <w:tcW w:type="dxa" w:w="2160"/>
+          </w:tcPr>
+          <w:p>
+            <w:r>
+              <w:rPr>
+                <w:sz w:val="20"/>
+              </w:rPr>
+              <w:t>blooms_order</w:t>
+            </w:r>
+          </w:p>
+        </w:tc>
+        <w:tc>
+          <w:tcPr>
+            <w:tcW w:type="dxa" w:w="2160"/>
+          </w:tcPr>
+          <w:p>
+            <w:r>
+              <w:rPr>
+                <w:sz w:val="20"/>
+              </w:rPr>
+              <w:t>Categorical</w:t>
+            </w:r>
+          </w:p>
+        </w:tc>
+        <w:tc>
+          <w:tcPr>
+            <w:tcW w:type="dxa" w:w="2160"/>
+          </w:tcPr>
+          <w:p>
+            <w:r>
+              <w:rPr>
+                <w:sz w:val="20"/>
+              </w:rPr>
+              <w:t>lower (remember/understand/apply) | higher (analyze/evaluate/create).</w:t>
+            </w:r>
+          </w:p>
+        </w:tc>
+        <w:tc>
+          <w:tcPr>
+            <w:tcW w:type="dxa" w:w="2160"/>
+          </w:tcPr>
+          <w:p>
+            <w:r>
+              <w:rPr>
+                <w:sz w:val="20"/>
+              </w:rPr>
+              <w:t>higher</w:t>
+            </w:r>
+          </w:p>
+        </w:tc>
+      </w:tr>
+      <w:tr>
+        <w:tc>
+          <w:tcPr>
+            <w:tcW w:type="dxa" w:w="2160"/>
+            <w:shd w:fill="D9E2F3"/>
+          </w:tcPr>
+          <w:p>
+            <w:r>
+              <w:rPr>
+                <w:sz w:val="20"/>
+              </w:rPr>
+              <w:t>measurement_type</w:t>
+            </w:r>
+          </w:p>
+        </w:tc>
+        <w:tc>
+          <w:tcPr>
+            <w:tcW w:type="dxa" w:w="2160"/>
+            <w:shd w:fill="D9E2F3"/>
+          </w:tcPr>
+          <w:p>
+            <w:r>
+              <w:rPr>
+                <w:sz w:val="20"/>
+              </w:rPr>
+              <w:t>Categorical</w:t>
+            </w:r>
+          </w:p>
+        </w:tc>
+        <w:tc>
+          <w:tcPr>
+            <w:tcW w:type="dxa" w:w="2160"/>
+            <w:shd w:fill="D9E2F3"/>
+          </w:tcPr>
+          <w:p>
+            <w:r>
+              <w:rPr>
+                <w:sz w:val="20"/>
+              </w:rPr>
+              <w:t>test | questionnaire | rubric | log_data | think_aloud | mixed</w:t>
+            </w:r>
+          </w:p>
+        </w:tc>
+        <w:tc>
+          <w:tcPr>
+            <w:tcW w:type="dxa" w:w="2160"/>
+            <w:shd w:fill="D9E2F3"/>
+          </w:tcPr>
+          <w:p>
+            <w:r>
+              <w:rPr>
+                <w:sz w:val="20"/>
+              </w:rPr>
+              <w:t>test</w:t>
+            </w:r>
+          </w:p>
+        </w:tc>
+      </w:tr>
+      <w:tr>
+        <w:tc>
+          <w:tcPr>
+            <w:tcW w:type="dxa" w:w="2160"/>
+          </w:tcPr>
+          <w:p>
+            <w:r>
+              <w:rPr>
+                <w:sz w:val="20"/>
+              </w:rPr>
+              <w:t>measurement_timing</w:t>
+            </w:r>
+          </w:p>
+        </w:tc>
+        <w:tc>
+          <w:tcPr>
+            <w:tcW w:type="dxa" w:w="2160"/>
+          </w:tcPr>
+          <w:p>
+            <w:r>
+              <w:rPr>
+                <w:sz w:val="20"/>
+              </w:rPr>
+              <w:t>Categorical</w:t>
+            </w:r>
+          </w:p>
+        </w:tc>
+        <w:tc>
+          <w:tcPr>
+            <w:tcW w:type="dxa" w:w="2160"/>
+          </w:tcPr>
+          <w:p>
+            <w:r>
+              <w:rPr>
+                <w:sz w:val="20"/>
+              </w:rPr>
+              <w:t>immediate_posttest: within 1 week of intervention. delayed_posttest: &gt;1 week after. during_intervention: measured while intervention ongoing.</w:t>
+            </w:r>
+          </w:p>
+        </w:tc>
+        <w:tc>
+          <w:tcPr>
+            <w:tcW w:type="dxa" w:w="2160"/>
+          </w:tcPr>
+          <w:p>
+            <w:r>
+              <w:rPr>
+                <w:sz w:val="20"/>
+              </w:rPr>
+              <w:t>immediate_posttest</w:t>
+            </w:r>
+          </w:p>
+        </w:tc>
+      </w:tr>
+      <w:tr>
+        <w:tc>
+          <w:tcPr>
+            <w:tcW w:type="dxa" w:w="2160"/>
+            <w:shd w:fill="D9E2F3"/>
+          </w:tcPr>
+          <w:p>
+            <w:r>
+              <w:rPr>
+                <w:sz w:val="20"/>
+              </w:rPr>
+              <w:t>reliability_alpha</w:t>
+            </w:r>
+          </w:p>
+        </w:tc>
+        <w:tc>
+          <w:tcPr>
+            <w:tcW w:type="dxa" w:w="2160"/>
+            <w:shd w:fill="D9E2F3"/>
+          </w:tcPr>
+          <w:p>
+            <w:r>
+              <w:rPr>
+                <w:sz w:val="20"/>
+              </w:rPr>
+              <w:t>Numeric</w:t>
+            </w:r>
+          </w:p>
+        </w:tc>
+        <w:tc>
+          <w:tcPr>
+            <w:tcW w:type="dxa" w:w="2160"/>
+            <w:shd w:fill="D9E2F3"/>
+          </w:tcPr>
+          <w:p>
+            <w:r>
+              <w:rPr>
+                <w:sz w:val="20"/>
+              </w:rPr>
+              <w:t>Cronbach's alpha or equivalent reliability coefficient for the measure. Leave blank if not reported.</w:t>
+            </w:r>
+          </w:p>
+        </w:tc>
+        <w:tc>
+          <w:tcPr>
+            <w:tcW w:type="dxa" w:w="2160"/>
+            <w:shd w:fill="D9E2F3"/>
+          </w:tcPr>
+          <w:p>
+            <w:r>
+              <w:rPr>
+                <w:sz w:val="20"/>
+              </w:rPr>
+              <w:t>0.87</w:t>
+            </w:r>
+          </w:p>
+        </w:tc>
+      </w:tr>
+    </w:tbl>
+    <w:p>
+      <w:pPr>
+        <w:pStyle w:val="Heading3"/>
+      </w:pPr>
+      <w:r>
+        <w:t>Raw Statistics — Post-test (4)</w:t>
+      </w:r>
+    </w:p>
+    <w:tbl>
+      <w:tblPr>
+        <w:tblW w:type="auto" w:w="0"/>
+        <w:jc w:val="center"/>
+        <w:tblLook w:firstColumn="1" w:firstRow="1" w:lastColumn="0" w:lastRow="0" w:noHBand="0" w:noVBand="1" w:val="04A0"/>
+      </w:tblPr>
+      <w:tblGrid>
+        <w:gridCol w:w="2160"/>
+        <w:gridCol w:w="2160"/>
+        <w:gridCol w:w="2160"/>
+        <w:gridCol w:w="2160"/>
+      </w:tblGrid>
+      <w:tr>
+        <w:tc>
+          <w:tcPr>
+            <w:tcW w:type="dxa" w:w="2160"/>
+            <w:shd w:fill="1F4E79"/>
+          </w:tcPr>
+          <w:p>
+            <w:r>
+              <w:rPr>
+                <w:b/>
+                <w:color w:val="FFFFFF"/>
+                <w:sz w:val="20"/>
+              </w:rPr>
+              <w:t>Variable</w:t>
+            </w:r>
+          </w:p>
+        </w:tc>
+        <w:tc>
+          <w:tcPr>
+            <w:tcW w:type="dxa" w:w="2160"/>
+            <w:shd w:fill="1F4E79"/>
+          </w:tcPr>
+          <w:p>
+            <w:r>
+              <w:rPr>
+                <w:b/>
+                <w:color w:val="FFFFFF"/>
+                <w:sz w:val="20"/>
+              </w:rPr>
+              <w:t>Type</w:t>
+            </w:r>
+          </w:p>
+        </w:tc>
+        <w:tc>
+          <w:tcPr>
+            <w:tcW w:type="dxa" w:w="2160"/>
+            <w:shd w:fill="1F4E79"/>
+          </w:tcPr>
+          <w:p>
+            <w:r>
+              <w:rPr>
+                <w:b/>
+                <w:color w:val="FFFFFF"/>
+                <w:sz w:val="20"/>
+              </w:rPr>
+              <w:t>Definition &amp; Rules</w:t>
+            </w:r>
+          </w:p>
+        </w:tc>
+        <w:tc>
+          <w:tcPr>
+            <w:tcW w:type="dxa" w:w="2160"/>
+            <w:shd w:fill="1F4E79"/>
+          </w:tcPr>
+          <w:p>
+            <w:r>
+              <w:rPr>
+                <w:b/>
+                <w:color w:val="FFFFFF"/>
+                <w:sz w:val="20"/>
+              </w:rPr>
+              <w:t>Example</w:t>
+            </w:r>
+          </w:p>
+        </w:tc>
+      </w:tr>
+      <w:tr>
+        <w:tc>
+          <w:tcPr>
+            <w:tcW w:type="dxa" w:w="2160"/>
+            <w:shd w:fill="D9E2F3"/>
+          </w:tcPr>
+          <w:p>
+            <w:r>
+              <w:rPr>
+                <w:sz w:val="20"/>
+              </w:rPr>
+              <w:t>m_treatment_post</w:t>
+            </w:r>
+          </w:p>
+        </w:tc>
+        <w:tc>
+          <w:tcPr>
+            <w:tcW w:type="dxa" w:w="2160"/>
+            <w:shd w:fill="D9E2F3"/>
+          </w:tcPr>
+          <w:p>
+            <w:r>
+              <w:rPr>
+                <w:sz w:val="20"/>
+              </w:rPr>
+              <w:t>Numeric</w:t>
+            </w:r>
+          </w:p>
+        </w:tc>
+        <w:tc>
+          <w:tcPr>
+            <w:tcW w:type="dxa" w:w="2160"/>
+            <w:shd w:fill="D9E2F3"/>
+          </w:tcPr>
+          <w:p>
+            <w:r>
+              <w:rPr>
+                <w:sz w:val="20"/>
+              </w:rPr>
+              <w:t>Post-test mean for the treatment/GenAI group.</w:t>
+            </w:r>
+          </w:p>
+        </w:tc>
+        <w:tc>
+          <w:tcPr>
+            <w:tcW w:type="dxa" w:w="2160"/>
+            <w:shd w:fill="D9E2F3"/>
+          </w:tcPr>
+          <w:p>
+            <w:r>
+              <w:rPr>
+                <w:sz w:val="20"/>
+              </w:rPr>
+              <w:t>82.3</w:t>
+            </w:r>
+          </w:p>
+        </w:tc>
+      </w:tr>
+      <w:tr>
+        <w:tc>
+          <w:tcPr>
+            <w:tcW w:type="dxa" w:w="2160"/>
+          </w:tcPr>
+          <w:p>
+            <w:r>
+              <w:rPr>
+                <w:sz w:val="20"/>
+              </w:rPr>
+              <w:t>sd_treatment_post</w:t>
+            </w:r>
+          </w:p>
+        </w:tc>
+        <w:tc>
+          <w:tcPr>
+            <w:tcW w:type="dxa" w:w="2160"/>
+          </w:tcPr>
+          <w:p>
+            <w:r>
+              <w:rPr>
+                <w:sz w:val="20"/>
+              </w:rPr>
+              <w:t>Numeric</w:t>
+            </w:r>
+          </w:p>
+        </w:tc>
+        <w:tc>
+          <w:tcPr>
+            <w:tcW w:type="dxa" w:w="2160"/>
+          </w:tcPr>
+          <w:p>
+            <w:r>
+              <w:rPr>
+                <w:sz w:val="20"/>
+              </w:rPr>
+              <w:t>Post-test SD for the treatment group. If SE reported, convert: SD = SE × √n.</w:t>
+            </w:r>
+          </w:p>
+        </w:tc>
+        <w:tc>
+          <w:tcPr>
+            <w:tcW w:type="dxa" w:w="2160"/>
+          </w:tcPr>
+          <w:p>
+            <w:r>
+              <w:rPr>
+                <w:sz w:val="20"/>
+              </w:rPr>
+              <w:t>11.5</w:t>
+            </w:r>
+          </w:p>
+        </w:tc>
+      </w:tr>
+      <w:tr>
+        <w:tc>
+          <w:tcPr>
+            <w:tcW w:type="dxa" w:w="2160"/>
+            <w:shd w:fill="D9E2F3"/>
+          </w:tcPr>
+          <w:p>
+            <w:r>
+              <w:rPr>
+                <w:sz w:val="20"/>
+              </w:rPr>
+              <w:t>m_control_post</w:t>
+            </w:r>
+          </w:p>
+        </w:tc>
+        <w:tc>
+          <w:tcPr>
+            <w:tcW w:type="dxa" w:w="2160"/>
+            <w:shd w:fill="D9E2F3"/>
+          </w:tcPr>
+          <w:p>
+            <w:r>
+              <w:rPr>
+                <w:sz w:val="20"/>
+              </w:rPr>
+              <w:t>Numeric</w:t>
+            </w:r>
+          </w:p>
+        </w:tc>
+        <w:tc>
+          <w:tcPr>
+            <w:tcW w:type="dxa" w:w="2160"/>
+            <w:shd w:fill="D9E2F3"/>
+          </w:tcPr>
+          <w:p>
+            <w:r>
+              <w:rPr>
+                <w:sz w:val="20"/>
+              </w:rPr>
+              <w:t>Post-test mean for the control group.</w:t>
+            </w:r>
+          </w:p>
+        </w:tc>
+        <w:tc>
+          <w:tcPr>
+            <w:tcW w:type="dxa" w:w="2160"/>
+            <w:shd w:fill="D9E2F3"/>
+          </w:tcPr>
+          <w:p>
+            <w:r>
+              <w:rPr>
+                <w:sz w:val="20"/>
+              </w:rPr>
+              <w:t>75.1</w:t>
+            </w:r>
+          </w:p>
+        </w:tc>
+      </w:tr>
+      <w:tr>
+        <w:tc>
+          <w:tcPr>
+            <w:tcW w:type="dxa" w:w="2160"/>
+          </w:tcPr>
+          <w:p>
+            <w:r>
+              <w:rPr>
+                <w:sz w:val="20"/>
+              </w:rPr>
+              <w:t>sd_control_post</w:t>
+            </w:r>
+          </w:p>
+        </w:tc>
+        <w:tc>
+          <w:tcPr>
+            <w:tcW w:type="dxa" w:w="2160"/>
+          </w:tcPr>
+          <w:p>
+            <w:r>
+              <w:rPr>
+                <w:sz w:val="20"/>
+              </w:rPr>
+              <w:t>Numeric</w:t>
+            </w:r>
+          </w:p>
+        </w:tc>
+        <w:tc>
+          <w:tcPr>
+            <w:tcW w:type="dxa" w:w="2160"/>
+          </w:tcPr>
+          <w:p>
+            <w:r>
+              <w:rPr>
+                <w:sz w:val="20"/>
+              </w:rPr>
+              <w:t>Post-test SD for the control group.</w:t>
+            </w:r>
+          </w:p>
+        </w:tc>
+        <w:tc>
+          <w:tcPr>
+            <w:tcW w:type="dxa" w:w="2160"/>
+          </w:tcPr>
+          <w:p>
+            <w:r>
+              <w:rPr>
+                <w:sz w:val="20"/>
+              </w:rPr>
+              <w:t>12.8</w:t>
+            </w:r>
+          </w:p>
+        </w:tc>
+      </w:tr>
+    </w:tbl>
+    <w:p>
+      <w:pPr>
+        <w:pStyle w:val="Heading3"/>
+      </w:pPr>
+      <w:r>
+        <w:t>Raw Statistics — Pre-test (4, optional)</w:t>
+      </w:r>
+    </w:p>
+    <w:tbl>
+      <w:tblPr>
+        <w:tblW w:type="auto" w:w="0"/>
+        <w:jc w:val="center"/>
+        <w:tblLook w:firstColumn="1" w:firstRow="1" w:lastColumn="0" w:lastRow="0" w:noHBand="0" w:noVBand="1" w:val="04A0"/>
+      </w:tblPr>
+      <w:tblGrid>
+        <w:gridCol w:w="2160"/>
+        <w:gridCol w:w="2160"/>
+        <w:gridCol w:w="2160"/>
+        <w:gridCol w:w="2160"/>
+      </w:tblGrid>
+      <w:tr>
+        <w:tc>
+          <w:tcPr>
+            <w:tcW w:type="dxa" w:w="2160"/>
+            <w:shd w:fill="1F4E79"/>
+          </w:tcPr>
+          <w:p>
+            <w:r>
+              <w:rPr>
+                <w:b/>
+                <w:color w:val="FFFFFF"/>
+                <w:sz w:val="20"/>
+              </w:rPr>
+              <w:t>Variable</w:t>
+            </w:r>
+          </w:p>
+        </w:tc>
+        <w:tc>
+          <w:tcPr>
+            <w:tcW w:type="dxa" w:w="2160"/>
+            <w:shd w:fill="1F4E79"/>
+          </w:tcPr>
+          <w:p>
+            <w:r>
+              <w:rPr>
+                <w:b/>
+                <w:color w:val="FFFFFF"/>
+                <w:sz w:val="20"/>
+              </w:rPr>
+              <w:t>Type</w:t>
+            </w:r>
+          </w:p>
+        </w:tc>
+        <w:tc>
+          <w:tcPr>
+            <w:tcW w:type="dxa" w:w="2160"/>
+            <w:shd w:fill="1F4E79"/>
+          </w:tcPr>
+          <w:p>
+            <w:r>
+              <w:rPr>
+                <w:b/>
+                <w:color w:val="FFFFFF"/>
+                <w:sz w:val="20"/>
+              </w:rPr>
+              <w:t>Definition &amp; Rules</w:t>
+            </w:r>
+          </w:p>
+        </w:tc>
+        <w:tc>
+          <w:tcPr>
+            <w:tcW w:type="dxa" w:w="2160"/>
+            <w:shd w:fill="1F4E79"/>
+          </w:tcPr>
+          <w:p>
+            <w:r>
+              <w:rPr>
+                <w:b/>
+                <w:color w:val="FFFFFF"/>
+                <w:sz w:val="20"/>
+              </w:rPr>
+              <w:t>Example</w:t>
+            </w:r>
+          </w:p>
+        </w:tc>
+      </w:tr>
+      <w:tr>
+        <w:tc>
+          <w:tcPr>
+            <w:tcW w:type="dxa" w:w="2160"/>
+            <w:shd w:fill="D9E2F3"/>
+          </w:tcPr>
+          <w:p>
+            <w:r>
+              <w:rPr>
+                <w:sz w:val="20"/>
+              </w:rPr>
+              <w:t>m_treatment_pre</w:t>
+            </w:r>
+          </w:p>
+        </w:tc>
+        <w:tc>
+          <w:tcPr>
+            <w:tcW w:type="dxa" w:w="2160"/>
+            <w:shd w:fill="D9E2F3"/>
+          </w:tcPr>
+          <w:p>
+            <w:r>
+              <w:rPr>
+                <w:sz w:val="20"/>
+              </w:rPr>
+              <w:t>Numeric</w:t>
+            </w:r>
+          </w:p>
+        </w:tc>
+        <w:tc>
+          <w:tcPr>
+            <w:tcW w:type="dxa" w:w="2160"/>
+            <w:shd w:fill="D9E2F3"/>
+          </w:tcPr>
+          <w:p>
+            <w:r>
+              <w:rPr>
+                <w:sz w:val="20"/>
+              </w:rPr>
+              <w:t>Pre-test mean for treatment group. Extract when available for sensitivity analysis.</w:t>
+            </w:r>
+          </w:p>
+        </w:tc>
+        <w:tc>
+          <w:tcPr>
+            <w:tcW w:type="dxa" w:w="2160"/>
+            <w:shd w:fill="D9E2F3"/>
+          </w:tcPr>
+          <w:p>
+            <w:r>
+              <w:rPr>
+                <w:sz w:val="20"/>
+              </w:rPr>
+              <w:t>70.2</w:t>
+            </w:r>
+          </w:p>
+        </w:tc>
+      </w:tr>
+      <w:tr>
+        <w:tc>
+          <w:tcPr>
+            <w:tcW w:type="dxa" w:w="2160"/>
+          </w:tcPr>
+          <w:p>
+            <w:r>
+              <w:rPr>
+                <w:sz w:val="20"/>
+              </w:rPr>
+              <w:t>sd_treatment_pre</w:t>
+            </w:r>
+          </w:p>
+        </w:tc>
+        <w:tc>
+          <w:tcPr>
+            <w:tcW w:type="dxa" w:w="2160"/>
+          </w:tcPr>
+          <w:p>
+            <w:r>
+              <w:rPr>
+                <w:sz w:val="20"/>
+              </w:rPr>
+              <w:t>Numeric</w:t>
+            </w:r>
+          </w:p>
+        </w:tc>
+        <w:tc>
+          <w:tcPr>
+            <w:tcW w:type="dxa" w:w="2160"/>
+          </w:tcPr>
+          <w:p>
+            <w:r>
+              <w:rPr>
+                <w:sz w:val="20"/>
+              </w:rPr>
+              <w:t>Pre-test SD for treatment group.</w:t>
+            </w:r>
+          </w:p>
+        </w:tc>
+        <w:tc>
+          <w:tcPr>
+            <w:tcW w:type="dxa" w:w="2160"/>
+          </w:tcPr>
+          <w:p>
+            <w:r>
+              <w:rPr>
+                <w:sz w:val="20"/>
+              </w:rPr>
+              <w:t>10.1</w:t>
+            </w:r>
+          </w:p>
+        </w:tc>
+      </w:tr>
+      <w:tr>
+        <w:tc>
+          <w:tcPr>
+            <w:tcW w:type="dxa" w:w="2160"/>
+            <w:shd w:fill="D9E2F3"/>
+          </w:tcPr>
+          <w:p>
+            <w:r>
+              <w:rPr>
+                <w:sz w:val="20"/>
+              </w:rPr>
+              <w:t>m_control_pre</w:t>
+            </w:r>
+          </w:p>
+        </w:tc>
+        <w:tc>
+          <w:tcPr>
+            <w:tcW w:type="dxa" w:w="2160"/>
+            <w:shd w:fill="D9E2F3"/>
+          </w:tcPr>
+          <w:p>
+            <w:r>
+              <w:rPr>
+                <w:sz w:val="20"/>
+              </w:rPr>
+              <w:t>Numeric</w:t>
+            </w:r>
+          </w:p>
+        </w:tc>
+        <w:tc>
+          <w:tcPr>
+            <w:tcW w:type="dxa" w:w="2160"/>
+            <w:shd w:fill="D9E2F3"/>
+          </w:tcPr>
+          <w:p>
+            <w:r>
+              <w:rPr>
+                <w:sz w:val="20"/>
+              </w:rPr>
+              <w:t>Pre-test mean for control group.</w:t>
+            </w:r>
+          </w:p>
+        </w:tc>
+        <w:tc>
+          <w:tcPr>
+            <w:tcW w:type="dxa" w:w="2160"/>
+            <w:shd w:fill="D9E2F3"/>
+          </w:tcPr>
+          <w:p>
+            <w:r>
+              <w:rPr>
+                <w:sz w:val="20"/>
+              </w:rPr>
+              <w:t>69.8</w:t>
+            </w:r>
+          </w:p>
+        </w:tc>
+      </w:tr>
+      <w:tr>
+        <w:tc>
+          <w:tcPr>
+            <w:tcW w:type="dxa" w:w="2160"/>
+          </w:tcPr>
+          <w:p>
+            <w:r>
+              <w:rPr>
+                <w:sz w:val="20"/>
+              </w:rPr>
+              <w:t>sd_control_pre</w:t>
+            </w:r>
+          </w:p>
+        </w:tc>
+        <w:tc>
+          <w:tcPr>
+            <w:tcW w:type="dxa" w:w="2160"/>
+          </w:tcPr>
+          <w:p>
+            <w:r>
+              <w:rPr>
+                <w:sz w:val="20"/>
+              </w:rPr>
+              <w:t>Numeric</w:t>
+            </w:r>
+          </w:p>
+        </w:tc>
+        <w:tc>
+          <w:tcPr>
+            <w:tcW w:type="dxa" w:w="2160"/>
+          </w:tcPr>
+          <w:p>
+            <w:r>
+              <w:rPr>
+                <w:sz w:val="20"/>
+              </w:rPr>
+              <w:t>Pre-test SD for control group.</w:t>
+            </w:r>
+          </w:p>
+        </w:tc>
+        <w:tc>
+          <w:tcPr>
+            <w:tcW w:type="dxa" w:w="2160"/>
+          </w:tcPr>
+          <w:p>
+            <w:r>
+              <w:rPr>
+                <w:sz w:val="20"/>
+              </w:rPr>
+              <w:t>10.5</w:t>
+            </w:r>
+          </w:p>
+        </w:tc>
+      </w:tr>
+    </w:tbl>
+    <w:p>
+      <w:pPr>
+        <w:pStyle w:val="Heading3"/>
+      </w:pPr>
+      <w:r>
+        <w:t>Alternative Statistics (4, when M/SD unavailable)</w:t>
+      </w:r>
+    </w:p>
+    <w:tbl>
+      <w:tblPr>
+        <w:tblW w:type="auto" w:w="0"/>
+        <w:jc w:val="center"/>
+        <w:tblLook w:firstColumn="1" w:firstRow="1" w:lastColumn="0" w:lastRow="0" w:noHBand="0" w:noVBand="1" w:val="04A0"/>
+      </w:tblPr>
+      <w:tblGrid>
+        <w:gridCol w:w="2160"/>
+        <w:gridCol w:w="2160"/>
+        <w:gridCol w:w="2160"/>
+        <w:gridCol w:w="2160"/>
+      </w:tblGrid>
+      <w:tr>
+        <w:tc>
+          <w:tcPr>
+            <w:tcW w:type="dxa" w:w="2160"/>
+            <w:shd w:fill="1F4E79"/>
+          </w:tcPr>
+          <w:p>
+            <w:r>
+              <w:rPr>
+                <w:b/>
+                <w:color w:val="FFFFFF"/>
+                <w:sz w:val="20"/>
+              </w:rPr>
+              <w:t>Variable</w:t>
+            </w:r>
+          </w:p>
+        </w:tc>
+        <w:tc>
+          <w:tcPr>
+            <w:tcW w:type="dxa" w:w="2160"/>
+            <w:shd w:fill="1F4E79"/>
+          </w:tcPr>
+          <w:p>
+            <w:r>
+              <w:rPr>
+                <w:b/>
+                <w:color w:val="FFFFFF"/>
+                <w:sz w:val="20"/>
+              </w:rPr>
+              <w:t>Type</w:t>
+            </w:r>
+          </w:p>
+        </w:tc>
+        <w:tc>
+          <w:tcPr>
+            <w:tcW w:type="dxa" w:w="2160"/>
+            <w:shd w:fill="1F4E79"/>
+          </w:tcPr>
+          <w:p>
+            <w:r>
+              <w:rPr>
+                <w:b/>
+                <w:color w:val="FFFFFF"/>
+                <w:sz w:val="20"/>
+              </w:rPr>
+              <w:t>Definition &amp; Rules</w:t>
+            </w:r>
+          </w:p>
+        </w:tc>
+        <w:tc>
+          <w:tcPr>
+            <w:tcW w:type="dxa" w:w="2160"/>
+            <w:shd w:fill="1F4E79"/>
+          </w:tcPr>
+          <w:p>
+            <w:r>
+              <w:rPr>
+                <w:b/>
+                <w:color w:val="FFFFFF"/>
+                <w:sz w:val="20"/>
+              </w:rPr>
+              <w:t>Example</w:t>
+            </w:r>
+          </w:p>
+        </w:tc>
+      </w:tr>
+      <w:tr>
+        <w:tc>
+          <w:tcPr>
+            <w:tcW w:type="dxa" w:w="2160"/>
+            <w:shd w:fill="D9E2F3"/>
+          </w:tcPr>
+          <w:p>
+            <w:r>
+              <w:rPr>
+                <w:sz w:val="20"/>
+              </w:rPr>
+              <w:t>reported_stat_type</w:t>
+            </w:r>
+          </w:p>
+        </w:tc>
+        <w:tc>
+          <w:tcPr>
+            <w:tcW w:type="dxa" w:w="2160"/>
+            <w:shd w:fill="D9E2F3"/>
+          </w:tcPr>
+          <w:p>
+            <w:r>
+              <w:rPr>
+                <w:sz w:val="20"/>
+              </w:rPr>
+              <w:t>Categorical</w:t>
+            </w:r>
+          </w:p>
+        </w:tc>
+        <w:tc>
+          <w:tcPr>
+            <w:tcW w:type="dxa" w:w="2160"/>
+            <w:shd w:fill="D9E2F3"/>
+          </w:tcPr>
+          <w:p>
+            <w:r>
+              <w:rPr>
+                <w:sz w:val="20"/>
+              </w:rPr>
+              <w:t>t | F | chi2 | p_only | d | eta_sq | r | OR | other. Record the type of statistic available.</w:t>
+            </w:r>
+          </w:p>
+        </w:tc>
+        <w:tc>
+          <w:tcPr>
+            <w:tcW w:type="dxa" w:w="2160"/>
+            <w:shd w:fill="D9E2F3"/>
+          </w:tcPr>
+          <w:p>
+            <w:r>
+              <w:rPr>
+                <w:sz w:val="20"/>
+              </w:rPr>
+              <w:t>t</w:t>
+            </w:r>
+          </w:p>
+        </w:tc>
+      </w:tr>
+      <w:tr>
+        <w:tc>
+          <w:tcPr>
+            <w:tcW w:type="dxa" w:w="2160"/>
+          </w:tcPr>
+          <w:p>
+            <w:r>
+              <w:rPr>
+                <w:sz w:val="20"/>
+              </w:rPr>
+              <w:t>reported_stat_value</w:t>
+            </w:r>
+          </w:p>
+        </w:tc>
+        <w:tc>
+          <w:tcPr>
+            <w:tcW w:type="dxa" w:w="2160"/>
+          </w:tcPr>
+          <w:p>
+            <w:r>
+              <w:rPr>
+                <w:sz w:val="20"/>
+              </w:rPr>
+              <w:t>Numeric</w:t>
+            </w:r>
+          </w:p>
+        </w:tc>
+        <w:tc>
+          <w:tcPr>
+            <w:tcW w:type="dxa" w:w="2160"/>
+          </w:tcPr>
+          <w:p>
+            <w:r>
+              <w:rPr>
+                <w:sz w:val="20"/>
+              </w:rPr>
+              <w:t>The numeric value of the reported statistic.</w:t>
+            </w:r>
+          </w:p>
+        </w:tc>
+        <w:tc>
+          <w:tcPr>
+            <w:tcW w:type="dxa" w:w="2160"/>
+          </w:tcPr>
+          <w:p>
+            <w:r>
+              <w:rPr>
+                <w:sz w:val="20"/>
+              </w:rPr>
+              <w:t>2.45</w:t>
+            </w:r>
+          </w:p>
+        </w:tc>
+      </w:tr>
+      <w:tr>
+        <w:tc>
+          <w:tcPr>
+            <w:tcW w:type="dxa" w:w="2160"/>
+            <w:shd w:fill="D9E2F3"/>
+          </w:tcPr>
+          <w:p>
+            <w:r>
+              <w:rPr>
+                <w:sz w:val="20"/>
+              </w:rPr>
+              <w:t>reported_df</w:t>
+            </w:r>
+          </w:p>
+        </w:tc>
+        <w:tc>
+          <w:tcPr>
+            <w:tcW w:type="dxa" w:w="2160"/>
+            <w:shd w:fill="D9E2F3"/>
+          </w:tcPr>
+          <w:p>
+            <w:r>
+              <w:rPr>
+                <w:sz w:val="20"/>
+              </w:rPr>
+              <w:t>Numeric</w:t>
+            </w:r>
+          </w:p>
+        </w:tc>
+        <w:tc>
+          <w:tcPr>
+            <w:tcW w:type="dxa" w:w="2160"/>
+            <w:shd w:fill="D9E2F3"/>
+          </w:tcPr>
+          <w:p>
+            <w:r>
+              <w:rPr>
+                <w:sz w:val="20"/>
+              </w:rPr>
+              <w:t>Degrees of freedom associated with the statistic. For t: df = n1+n2-2.</w:t>
+            </w:r>
+          </w:p>
+        </w:tc>
+        <w:tc>
+          <w:tcPr>
+            <w:tcW w:type="dxa" w:w="2160"/>
+            <w:shd w:fill="D9E2F3"/>
+          </w:tcPr>
+          <w:p>
+            <w:r>
+              <w:rPr>
+                <w:sz w:val="20"/>
+              </w:rPr>
+              <w:t>86</w:t>
+            </w:r>
+          </w:p>
+        </w:tc>
+      </w:tr>
+      <w:tr>
+        <w:tc>
+          <w:tcPr>
+            <w:tcW w:type="dxa" w:w="2160"/>
+          </w:tcPr>
+          <w:p>
+            <w:r>
+              <w:rPr>
+                <w:sz w:val="20"/>
+              </w:rPr>
+              <w:t>reported_p</w:t>
+            </w:r>
+          </w:p>
+        </w:tc>
+        <w:tc>
+          <w:tcPr>
+            <w:tcW w:type="dxa" w:w="2160"/>
+          </w:tcPr>
+          <w:p>
+            <w:r>
+              <w:rPr>
+                <w:sz w:val="20"/>
+              </w:rPr>
+              <w:t>Numeric</w:t>
+            </w:r>
+          </w:p>
+        </w:tc>
+        <w:tc>
+          <w:tcPr>
+            <w:tcW w:type="dxa" w:w="2160"/>
+          </w:tcPr>
+          <w:p>
+            <w:r>
+              <w:rPr>
+                <w:sz w:val="20"/>
+              </w:rPr>
+              <w:t>p-value as reported. Record exact value if given (e.g., 0.003), not 'p &lt; .05'.</w:t>
+            </w:r>
+          </w:p>
+        </w:tc>
+        <w:tc>
+          <w:tcPr>
+            <w:tcW w:type="dxa" w:w="2160"/>
+          </w:tcPr>
+          <w:p>
+            <w:r>
+              <w:rPr>
+                <w:sz w:val="20"/>
+              </w:rPr>
+              <w:t>0.016</w:t>
+            </w:r>
+          </w:p>
+        </w:tc>
+      </w:tr>
+    </w:tbl>
+    <w:p>
+      <w:pPr>
+        <w:pStyle w:val="Heading3"/>
+      </w:pPr>
+      <w:r>
+        <w:t>Calculated Effect Sizes (6)</w:t>
+      </w:r>
+    </w:p>
+    <w:tbl>
+      <w:tblPr>
+        <w:tblW w:type="auto" w:w="0"/>
+        <w:jc w:val="center"/>
+        <w:tblLook w:firstColumn="1" w:firstRow="1" w:lastColumn="0" w:lastRow="0" w:noHBand="0" w:noVBand="1" w:val="04A0"/>
+      </w:tblPr>
+      <w:tblGrid>
+        <w:gridCol w:w="2160"/>
+        <w:gridCol w:w="2160"/>
+        <w:gridCol w:w="2160"/>
+        <w:gridCol w:w="2160"/>
+      </w:tblGrid>
+      <w:tr>
+        <w:tc>
+          <w:tcPr>
+            <w:tcW w:type="dxa" w:w="2160"/>
+            <w:shd w:fill="1F4E79"/>
+          </w:tcPr>
+          <w:p>
+            <w:r>
+              <w:rPr>
+                <w:b/>
+                <w:color w:val="FFFFFF"/>
+                <w:sz w:val="20"/>
+              </w:rPr>
+              <w:t>Variable</w:t>
+            </w:r>
+          </w:p>
+        </w:tc>
+        <w:tc>
+          <w:tcPr>
+            <w:tcW w:type="dxa" w:w="2160"/>
+            <w:shd w:fill="1F4E79"/>
+          </w:tcPr>
+          <w:p>
+            <w:r>
+              <w:rPr>
+                <w:b/>
+                <w:color w:val="FFFFFF"/>
+                <w:sz w:val="20"/>
+              </w:rPr>
+              <w:t>Type</w:t>
+            </w:r>
+          </w:p>
+        </w:tc>
+        <w:tc>
+          <w:tcPr>
+            <w:tcW w:type="dxa" w:w="2160"/>
+            <w:shd w:fill="1F4E79"/>
+          </w:tcPr>
+          <w:p>
+            <w:r>
+              <w:rPr>
+                <w:b/>
+                <w:color w:val="FFFFFF"/>
+                <w:sz w:val="20"/>
+              </w:rPr>
+              <w:t>Definition &amp; Rules</w:t>
+            </w:r>
+          </w:p>
+        </w:tc>
+        <w:tc>
+          <w:tcPr>
+            <w:tcW w:type="dxa" w:w="2160"/>
+            <w:shd w:fill="1F4E79"/>
+          </w:tcPr>
+          <w:p>
+            <w:r>
+              <w:rPr>
+                <w:b/>
+                <w:color w:val="FFFFFF"/>
+                <w:sz w:val="20"/>
+              </w:rPr>
+              <w:t>Example</w:t>
+            </w:r>
+          </w:p>
+        </w:tc>
+      </w:tr>
+      <w:tr>
+        <w:tc>
+          <w:tcPr>
+            <w:tcW w:type="dxa" w:w="2160"/>
+            <w:shd w:fill="D9E2F3"/>
+          </w:tcPr>
+          <w:p>
+            <w:r>
+              <w:rPr>
+                <w:sz w:val="20"/>
+              </w:rPr>
+              <w:t>hedges_g</w:t>
+            </w:r>
+          </w:p>
+        </w:tc>
+        <w:tc>
+          <w:tcPr>
+            <w:tcW w:type="dxa" w:w="2160"/>
+            <w:shd w:fill="D9E2F3"/>
+          </w:tcPr>
+          <w:p>
+            <w:r>
+              <w:rPr>
+                <w:sz w:val="20"/>
+              </w:rPr>
+              <w:t>Numeric</w:t>
+            </w:r>
+          </w:p>
+        </w:tc>
+        <w:tc>
+          <w:tcPr>
+            <w:tcW w:type="dxa" w:w="2160"/>
+            <w:shd w:fill="D9E2F3"/>
+          </w:tcPr>
+          <w:p>
+            <w:r>
+              <w:rPr>
+                <w:sz w:val="20"/>
+              </w:rPr>
+              <w:t>Hedges' g (bias-corrected standardized mean difference). Positive = GenAI group outperformed control.</w:t>
+            </w:r>
+          </w:p>
+        </w:tc>
+        <w:tc>
+          <w:tcPr>
+            <w:tcW w:type="dxa" w:w="2160"/>
+            <w:shd w:fill="D9E2F3"/>
+          </w:tcPr>
+          <w:p>
+            <w:r>
+              <w:rPr>
+                <w:sz w:val="20"/>
+              </w:rPr>
+              <w:t>0.54</w:t>
+            </w:r>
+          </w:p>
+        </w:tc>
+      </w:tr>
+      <w:tr>
+        <w:tc>
+          <w:tcPr>
+            <w:tcW w:type="dxa" w:w="2160"/>
+          </w:tcPr>
+          <w:p>
+            <w:r>
+              <w:rPr>
+                <w:sz w:val="20"/>
+              </w:rPr>
+              <w:t>se_g</w:t>
+            </w:r>
+          </w:p>
+        </w:tc>
+        <w:tc>
+          <w:tcPr>
+            <w:tcW w:type="dxa" w:w="2160"/>
+          </w:tcPr>
+          <w:p>
+            <w:r>
+              <w:rPr>
+                <w:sz w:val="20"/>
+              </w:rPr>
+              <w:t>Numeric</w:t>
+            </w:r>
+          </w:p>
+        </w:tc>
+        <w:tc>
+          <w:tcPr>
+            <w:tcW w:type="dxa" w:w="2160"/>
+          </w:tcPr>
+          <w:p>
+            <w:r>
+              <w:rPr>
+                <w:sz w:val="20"/>
+              </w:rPr>
+              <w:t>Standard error of Hedges' g.</w:t>
+            </w:r>
+          </w:p>
+        </w:tc>
+        <w:tc>
+          <w:tcPr>
+            <w:tcW w:type="dxa" w:w="2160"/>
+          </w:tcPr>
+          <w:p>
+            <w:r>
+              <w:rPr>
+                <w:sz w:val="20"/>
+              </w:rPr>
+              <w:t>0.15</w:t>
+            </w:r>
+          </w:p>
+        </w:tc>
+      </w:tr>
+      <w:tr>
+        <w:tc>
+          <w:tcPr>
+            <w:tcW w:type="dxa" w:w="2160"/>
+            <w:shd w:fill="D9E2F3"/>
+          </w:tcPr>
+          <w:p>
+            <w:r>
+              <w:rPr>
+                <w:sz w:val="20"/>
+              </w:rPr>
+              <w:t>var_g</w:t>
+            </w:r>
+          </w:p>
+        </w:tc>
+        <w:tc>
+          <w:tcPr>
+            <w:tcW w:type="dxa" w:w="2160"/>
+            <w:shd w:fill="D9E2F3"/>
+          </w:tcPr>
+          <w:p>
+            <w:r>
+              <w:rPr>
+                <w:sz w:val="20"/>
+              </w:rPr>
+              <w:t>Numeric</w:t>
+            </w:r>
+          </w:p>
+        </w:tc>
+        <w:tc>
+          <w:tcPr>
+            <w:tcW w:type="dxa" w:w="2160"/>
+            <w:shd w:fill="D9E2F3"/>
+          </w:tcPr>
+          <w:p>
+            <w:r>
+              <w:rPr>
+                <w:sz w:val="20"/>
+              </w:rPr>
+              <w:t>Variance of Hedges' g. var_g = se_g².</w:t>
+            </w:r>
+          </w:p>
+        </w:tc>
+        <w:tc>
+          <w:tcPr>
+            <w:tcW w:type="dxa" w:w="2160"/>
+            <w:shd w:fill="D9E2F3"/>
+          </w:tcPr>
+          <w:p>
+            <w:r>
+              <w:rPr>
+                <w:sz w:val="20"/>
+              </w:rPr>
+              <w:t>0.0225</w:t>
+            </w:r>
+          </w:p>
+        </w:tc>
+      </w:tr>
+      <w:tr>
+        <w:tc>
+          <w:tcPr>
+            <w:tcW w:type="dxa" w:w="2160"/>
+          </w:tcPr>
+          <w:p>
+            <w:r>
+              <w:rPr>
+                <w:sz w:val="20"/>
+              </w:rPr>
+              <w:t>ci_lower_95</w:t>
+            </w:r>
+          </w:p>
+        </w:tc>
+        <w:tc>
+          <w:tcPr>
+            <w:tcW w:type="dxa" w:w="2160"/>
+          </w:tcPr>
+          <w:p>
+            <w:r>
+              <w:rPr>
+                <w:sz w:val="20"/>
+              </w:rPr>
+              <w:t>Numeric</w:t>
+            </w:r>
+          </w:p>
+        </w:tc>
+        <w:tc>
+          <w:tcPr>
+            <w:tcW w:type="dxa" w:w="2160"/>
+          </w:tcPr>
+          <w:p>
+            <w:r>
+              <w:rPr>
+                <w:sz w:val="20"/>
+              </w:rPr>
+              <w:t>Lower bound of 95% confidence interval. ci_lower = g - 1.96 × se_g.</w:t>
+            </w:r>
+          </w:p>
+        </w:tc>
+        <w:tc>
+          <w:tcPr>
+            <w:tcW w:type="dxa" w:w="2160"/>
+          </w:tcPr>
+          <w:p>
+            <w:r>
+              <w:rPr>
+                <w:sz w:val="20"/>
+              </w:rPr>
+              <w:t>0.25</w:t>
+            </w:r>
+          </w:p>
+        </w:tc>
+      </w:tr>
+      <w:tr>
+        <w:tc>
+          <w:tcPr>
+            <w:tcW w:type="dxa" w:w="2160"/>
+            <w:shd w:fill="D9E2F3"/>
+          </w:tcPr>
+          <w:p>
+            <w:r>
+              <w:rPr>
+                <w:sz w:val="20"/>
+              </w:rPr>
+              <w:t>ci_upper_95</w:t>
+            </w:r>
+          </w:p>
+        </w:tc>
+        <w:tc>
+          <w:tcPr>
+            <w:tcW w:type="dxa" w:w="2160"/>
+            <w:shd w:fill="D9E2F3"/>
+          </w:tcPr>
+          <w:p>
+            <w:r>
+              <w:rPr>
+                <w:sz w:val="20"/>
+              </w:rPr>
+              <w:t>Numeric</w:t>
+            </w:r>
+          </w:p>
+        </w:tc>
+        <w:tc>
+          <w:tcPr>
+            <w:tcW w:type="dxa" w:w="2160"/>
+            <w:shd w:fill="D9E2F3"/>
+          </w:tcPr>
+          <w:p>
+            <w:r>
+              <w:rPr>
+                <w:sz w:val="20"/>
+              </w:rPr>
+              <w:t>Upper bound of 95% confidence interval. ci_upper = g + 1.96 × se_g.</w:t>
+            </w:r>
+          </w:p>
+        </w:tc>
+        <w:tc>
+          <w:tcPr>
+            <w:tcW w:type="dxa" w:w="2160"/>
+            <w:shd w:fill="D9E2F3"/>
+          </w:tcPr>
+          <w:p>
+            <w:r>
+              <w:rPr>
+                <w:sz w:val="20"/>
+              </w:rPr>
+              <w:t>0.83</w:t>
+            </w:r>
+          </w:p>
+        </w:tc>
+      </w:tr>
+      <w:tr>
+        <w:tc>
+          <w:tcPr>
+            <w:tcW w:type="dxa" w:w="2160"/>
+          </w:tcPr>
+          <w:p>
+            <w:r>
+              <w:rPr>
+                <w:sz w:val="20"/>
+              </w:rPr>
+              <w:t>calculation_method</w:t>
+            </w:r>
+          </w:p>
+        </w:tc>
+        <w:tc>
+          <w:tcPr>
+            <w:tcW w:type="dxa" w:w="2160"/>
+          </w:tcPr>
+          <w:p>
+            <w:r>
+              <w:rPr>
+                <w:sz w:val="20"/>
+              </w:rPr>
+              <w:t>Categorical</w:t>
+            </w:r>
+          </w:p>
+        </w:tc>
+        <w:tc>
+          <w:tcPr>
+            <w:tcW w:type="dxa" w:w="2160"/>
+          </w:tcPr>
+          <w:p>
+            <w:r>
+              <w:rPr>
+                <w:sz w:val="20"/>
+              </w:rPr>
+              <w:t>post_means | change_scores | t_to_g | F_to_g | p_to_g | reported_d_to_g | eta_to_g | r_to_g. Must match the actual formula used.</w:t>
+            </w:r>
+          </w:p>
+        </w:tc>
+        <w:tc>
+          <w:tcPr>
+            <w:tcW w:type="dxa" w:w="2160"/>
+          </w:tcPr>
+          <w:p>
+            <w:r>
+              <w:rPr>
+                <w:sz w:val="20"/>
+              </w:rPr>
+              <w:t>post_means</w:t>
+            </w:r>
+          </w:p>
+        </w:tc>
+      </w:tr>
+    </w:tbl>
+    <w:p>
+      <w:pPr>
+        <w:pStyle w:val="Heading3"/>
+      </w:pPr>
+      <w:r>
+        <w:t>Source Tracking (2)</w:t>
+      </w:r>
+    </w:p>
+    <w:tbl>
+      <w:tblPr>
+        <w:tblW w:type="auto" w:w="0"/>
+        <w:jc w:val="center"/>
+        <w:tblLook w:firstColumn="1" w:firstRow="1" w:lastColumn="0" w:lastRow="0" w:noHBand="0" w:noVBand="1" w:val="04A0"/>
+      </w:tblPr>
+      <w:tblGrid>
+        <w:gridCol w:w="2160"/>
+        <w:gridCol w:w="2160"/>
+        <w:gridCol w:w="2160"/>
+        <w:gridCol w:w="2160"/>
+      </w:tblGrid>
+      <w:tr>
+        <w:tc>
+          <w:tcPr>
+            <w:tcW w:type="dxa" w:w="2160"/>
+            <w:shd w:fill="1F4E79"/>
+          </w:tcPr>
+          <w:p>
+            <w:r>
+              <w:rPr>
+                <w:b/>
+                <w:color w:val="FFFFFF"/>
+                <w:sz w:val="20"/>
+              </w:rPr>
+              <w:t>Variable</w:t>
+            </w:r>
+          </w:p>
+        </w:tc>
+        <w:tc>
+          <w:tcPr>
+            <w:tcW w:type="dxa" w:w="2160"/>
+            <w:shd w:fill="1F4E79"/>
+          </w:tcPr>
+          <w:p>
+            <w:r>
+              <w:rPr>
+                <w:b/>
+                <w:color w:val="FFFFFF"/>
+                <w:sz w:val="20"/>
+              </w:rPr>
+              <w:t>Type</w:t>
+            </w:r>
+          </w:p>
+        </w:tc>
+        <w:tc>
+          <w:tcPr>
+            <w:tcW w:type="dxa" w:w="2160"/>
+            <w:shd w:fill="1F4E79"/>
+          </w:tcPr>
+          <w:p>
+            <w:r>
+              <w:rPr>
+                <w:b/>
+                <w:color w:val="FFFFFF"/>
+                <w:sz w:val="20"/>
+              </w:rPr>
+              <w:t>Definition &amp; Rules</w:t>
+            </w:r>
+          </w:p>
+        </w:tc>
+        <w:tc>
+          <w:tcPr>
+            <w:tcW w:type="dxa" w:w="2160"/>
+            <w:shd w:fill="1F4E79"/>
+          </w:tcPr>
+          <w:p>
+            <w:r>
+              <w:rPr>
+                <w:b/>
+                <w:color w:val="FFFFFF"/>
+                <w:sz w:val="20"/>
+              </w:rPr>
+              <w:t>Example</w:t>
+            </w:r>
+          </w:p>
+        </w:tc>
+      </w:tr>
+      <w:tr>
+        <w:tc>
+          <w:tcPr>
+            <w:tcW w:type="dxa" w:w="2160"/>
+            <w:shd w:fill="D9E2F3"/>
+          </w:tcPr>
+          <w:p>
+            <w:r>
+              <w:rPr>
+                <w:sz w:val="20"/>
+              </w:rPr>
+              <w:t>source_location</w:t>
+            </w:r>
+          </w:p>
+        </w:tc>
+        <w:tc>
+          <w:tcPr>
+            <w:tcW w:type="dxa" w:w="2160"/>
+            <w:shd w:fill="D9E2F3"/>
+          </w:tcPr>
+          <w:p>
+            <w:r>
+              <w:rPr>
+                <w:sz w:val="20"/>
+              </w:rPr>
+              <w:t>String</w:t>
+            </w:r>
+          </w:p>
+        </w:tc>
+        <w:tc>
+          <w:tcPr>
+            <w:tcW w:type="dxa" w:w="2160"/>
+            <w:shd w:fill="D9E2F3"/>
+          </w:tcPr>
+          <w:p>
+            <w:r>
+              <w:rPr>
+                <w:sz w:val="20"/>
+              </w:rPr>
+              <w:t>Exact location in the paper where key statistics were found.</w:t>
+            </w:r>
+          </w:p>
+        </w:tc>
+        <w:tc>
+          <w:tcPr>
+            <w:tcW w:type="dxa" w:w="2160"/>
+            <w:shd w:fill="D9E2F3"/>
+          </w:tcPr>
+          <w:p>
+            <w:r>
+              <w:rPr>
+                <w:sz w:val="20"/>
+              </w:rPr>
+              <w:t>Table 3, p.12</w:t>
+            </w:r>
+          </w:p>
+        </w:tc>
+      </w:tr>
+      <w:tr>
+        <w:tc>
+          <w:tcPr>
+            <w:tcW w:type="dxa" w:w="2160"/>
+          </w:tcPr>
+          <w:p>
+            <w:r>
+              <w:rPr>
+                <w:sz w:val="20"/>
+              </w:rPr>
+              <w:t>extraction_notes</w:t>
+            </w:r>
+          </w:p>
+        </w:tc>
+        <w:tc>
+          <w:tcPr>
+            <w:tcW w:type="dxa" w:w="2160"/>
+          </w:tcPr>
+          <w:p>
+            <w:r>
+              <w:rPr>
+                <w:sz w:val="20"/>
+              </w:rPr>
+              <w:t>String</w:t>
+            </w:r>
+          </w:p>
+        </w:tc>
+        <w:tc>
+          <w:tcPr>
+            <w:tcW w:type="dxa" w:w="2160"/>
+          </w:tcPr>
+          <w:p>
+            <w:r>
+              <w:rPr>
+                <w:sz w:val="20"/>
+              </w:rPr>
+              <w:t>Any notes about extraction difficulties, assumptions, or author contact.</w:t>
+            </w:r>
+          </w:p>
+        </w:tc>
+        <w:tc>
+          <w:tcPr>
+            <w:tcW w:type="dxa" w:w="2160"/>
+          </w:tcPr>
+          <w:p>
+            <w:r>
+              <w:rPr>
+                <w:sz w:val="20"/>
+              </w:rPr>
+              <w:t>SD estimated from CI</w:t>
+            </w:r>
+          </w:p>
+        </w:tc>
+      </w:tr>
+    </w:tbl>
+    <w:p>
+      <w:pPr>
+        <w:pStyle w:val="Heading3"/>
+      </w:pPr>
+      <w:r>
+        <w:t>Source Management (3)</w:t>
+      </w:r>
+    </w:p>
+    <w:tbl>
+      <w:tblPr>
+        <w:tblW w:type="auto" w:w="0"/>
+        <w:jc w:val="center"/>
+        <w:tblLook w:firstColumn="1" w:firstRow="1" w:lastColumn="0" w:lastRow="0" w:noHBand="0" w:noVBand="1" w:val="04A0"/>
+      </w:tblPr>
+      <w:tblGrid>
+        <w:gridCol w:w="2160"/>
+        <w:gridCol w:w="2160"/>
+        <w:gridCol w:w="2160"/>
+        <w:gridCol w:w="2160"/>
+      </w:tblGrid>
+      <w:tr>
+        <w:tc>
+          <w:tcPr>
+            <w:tcW w:type="dxa" w:w="2160"/>
+            <w:shd w:fill="1F4E79"/>
+          </w:tcPr>
+          <w:p>
+            <w:r>
+              <w:rPr>
+                <w:b/>
+                <w:color w:val="FFFFFF"/>
+                <w:sz w:val="20"/>
+              </w:rPr>
+              <w:t>Variable</w:t>
+            </w:r>
+          </w:p>
+        </w:tc>
+        <w:tc>
+          <w:tcPr>
+            <w:tcW w:type="dxa" w:w="2160"/>
+            <w:shd w:fill="1F4E79"/>
+          </w:tcPr>
+          <w:p>
+            <w:r>
+              <w:rPr>
+                <w:b/>
+                <w:color w:val="FFFFFF"/>
+                <w:sz w:val="20"/>
+              </w:rPr>
+              <w:t>Type</w:t>
+            </w:r>
+          </w:p>
+        </w:tc>
+        <w:tc>
+          <w:tcPr>
+            <w:tcW w:type="dxa" w:w="2160"/>
+            <w:shd w:fill="1F4E79"/>
+          </w:tcPr>
+          <w:p>
+            <w:r>
+              <w:rPr>
+                <w:b/>
+                <w:color w:val="FFFFFF"/>
+                <w:sz w:val="20"/>
+              </w:rPr>
+              <w:t>Definition &amp; Rules</w:t>
+            </w:r>
+          </w:p>
+        </w:tc>
+        <w:tc>
+          <w:tcPr>
+            <w:tcW w:type="dxa" w:w="2160"/>
+            <w:shd w:fill="1F4E79"/>
+          </w:tcPr>
+          <w:p>
+            <w:r>
+              <w:rPr>
+                <w:b/>
+                <w:color w:val="FFFFFF"/>
+                <w:sz w:val="20"/>
+              </w:rPr>
+              <w:t>Example</w:t>
+            </w:r>
+          </w:p>
+        </w:tc>
+      </w:tr>
+      <w:tr>
+        <w:tc>
+          <w:tcPr>
+            <w:tcW w:type="dxa" w:w="2160"/>
+            <w:shd w:fill="D9E2F3"/>
+          </w:tcPr>
+          <w:p>
+            <w:r>
+              <w:rPr>
+                <w:sz w:val="20"/>
+              </w:rPr>
+              <w:t>human_coder</w:t>
+            </w:r>
+          </w:p>
+        </w:tc>
+        <w:tc>
+          <w:tcPr>
+            <w:tcW w:type="dxa" w:w="2160"/>
+            <w:shd w:fill="D9E2F3"/>
+          </w:tcPr>
+          <w:p>
+            <w:r>
+              <w:rPr>
+                <w:sz w:val="20"/>
+              </w:rPr>
+              <w:t>String</w:t>
+            </w:r>
+          </w:p>
+        </w:tc>
+        <w:tc>
+          <w:tcPr>
+            <w:tcW w:type="dxa" w:w="2160"/>
+            <w:shd w:fill="D9E2F3"/>
+          </w:tcPr>
+          <w:p>
+            <w:r>
+              <w:rPr>
+                <w:sz w:val="20"/>
+              </w:rPr>
+              <w:t>Initials of the coder who completed this row.</w:t>
+            </w:r>
+          </w:p>
+        </w:tc>
+        <w:tc>
+          <w:tcPr>
+            <w:tcW w:type="dxa" w:w="2160"/>
+            <w:shd w:fill="D9E2F3"/>
+          </w:tcPr>
+          <w:p>
+            <w:r>
+              <w:rPr>
+                <w:sz w:val="20"/>
+              </w:rPr>
+              <w:t>HY</w:t>
+            </w:r>
+          </w:p>
+        </w:tc>
+      </w:tr>
+      <w:tr>
+        <w:tc>
+          <w:tcPr>
+            <w:tcW w:type="dxa" w:w="2160"/>
+          </w:tcPr>
+          <w:p>
+            <w:r>
+              <w:rPr>
+                <w:sz w:val="20"/>
+              </w:rPr>
+              <w:t>coding_date</w:t>
+            </w:r>
+          </w:p>
+        </w:tc>
+        <w:tc>
+          <w:tcPr>
+            <w:tcW w:type="dxa" w:w="2160"/>
+          </w:tcPr>
+          <w:p>
+            <w:r>
+              <w:rPr>
+                <w:sz w:val="20"/>
+              </w:rPr>
+              <w:t>Date</w:t>
+            </w:r>
+          </w:p>
+        </w:tc>
+        <w:tc>
+          <w:tcPr>
+            <w:tcW w:type="dxa" w:w="2160"/>
+          </w:tcPr>
+          <w:p>
+            <w:r>
+              <w:rPr>
+                <w:sz w:val="20"/>
+              </w:rPr>
+              <w:t>Date this row was completed (YYYY-MM-DD).</w:t>
+            </w:r>
+          </w:p>
+        </w:tc>
+        <w:tc>
+          <w:tcPr>
+            <w:tcW w:type="dxa" w:w="2160"/>
+          </w:tcPr>
+          <w:p>
+            <w:r>
+              <w:rPr>
+                <w:sz w:val="20"/>
+              </w:rPr>
+              <w:t>2026-03-15</w:t>
+            </w:r>
+          </w:p>
+        </w:tc>
+      </w:tr>
+      <w:tr>
+        <w:tc>
+          <w:tcPr>
+            <w:tcW w:type="dxa" w:w="2160"/>
+            <w:shd w:fill="D9E2F3"/>
+          </w:tcPr>
+          <w:p>
+            <w:r>
+              <w:rPr>
+                <w:sz w:val="20"/>
+              </w:rPr>
+              <w:t>verification_status</w:t>
+            </w:r>
+          </w:p>
+        </w:tc>
+        <w:tc>
+          <w:tcPr>
+            <w:tcW w:type="dxa" w:w="2160"/>
+            <w:shd w:fill="D9E2F3"/>
+          </w:tcPr>
+          <w:p>
+            <w:r>
+              <w:rPr>
+                <w:sz w:val="20"/>
+              </w:rPr>
+              <w:t>Categorical</w:t>
+            </w:r>
+          </w:p>
+        </w:tc>
+        <w:tc>
+          <w:tcPr>
+            <w:tcW w:type="dxa" w:w="2160"/>
+            <w:shd w:fill="D9E2F3"/>
+          </w:tcPr>
+          <w:p>
+            <w:r>
+              <w:rPr>
+                <w:sz w:val="20"/>
+              </w:rPr>
+              <w:t>initial: first pass by one coder. double_coded: independently coded by both. consensus_resolved: final value after discrepancy resolution.</w:t>
+            </w:r>
+          </w:p>
+        </w:tc>
+        <w:tc>
+          <w:tcPr>
+            <w:tcW w:type="dxa" w:w="2160"/>
+            <w:shd w:fill="D9E2F3"/>
+          </w:tcPr>
+          <w:p>
+            <w:r>
+              <w:rPr>
+                <w:sz w:val="20"/>
+              </w:rPr>
+              <w:t>double_coded</w:t>
+            </w:r>
+          </w:p>
+        </w:tc>
+      </w:tr>
+    </w:tbl>
+    <w:p>
+      <w:pPr>
+        <w:pStyle w:val="Heading2"/>
+      </w:pPr>
+      <w:r>
+        <w:t>6.2 Effect Size Identification</w:t>
       </w:r>
     </w:p>
     <w:p>
@@ -5292,7 +8070,765 @@
         <w:pStyle w:val="Heading2"/>
       </w:pPr>
       <w:r>
-        <w:t>7.1 Documentation Requirements</w:t>
+        <w:t>7.1 Complete Variable Reference (12 variables)</w:t>
+      </w:r>
+    </w:p>
+    <w:tbl>
+      <w:tblPr>
+        <w:tblW w:type="auto" w:w="0"/>
+        <w:jc w:val="center"/>
+        <w:tblLook w:firstColumn="1" w:firstRow="1" w:lastColumn="0" w:lastRow="0" w:noHBand="0" w:noVBand="1" w:val="04A0"/>
+      </w:tblPr>
+      <w:tblGrid>
+        <w:gridCol w:w="2160"/>
+        <w:gridCol w:w="2160"/>
+        <w:gridCol w:w="2160"/>
+        <w:gridCol w:w="2160"/>
+      </w:tblGrid>
+      <w:tr>
+        <w:tc>
+          <w:tcPr>
+            <w:tcW w:type="dxa" w:w="2160"/>
+            <w:shd w:fill="1F4E79"/>
+          </w:tcPr>
+          <w:p>
+            <w:r>
+              <w:rPr>
+                <w:b/>
+                <w:color w:val="FFFFFF"/>
+                <w:sz w:val="20"/>
+              </w:rPr>
+              <w:t>Variable</w:t>
+            </w:r>
+          </w:p>
+        </w:tc>
+        <w:tc>
+          <w:tcPr>
+            <w:tcW w:type="dxa" w:w="2160"/>
+            <w:shd w:fill="1F4E79"/>
+          </w:tcPr>
+          <w:p>
+            <w:r>
+              <w:rPr>
+                <w:b/>
+                <w:color w:val="FFFFFF"/>
+                <w:sz w:val="20"/>
+              </w:rPr>
+              <w:t>Type</w:t>
+            </w:r>
+          </w:p>
+        </w:tc>
+        <w:tc>
+          <w:tcPr>
+            <w:tcW w:type="dxa" w:w="2160"/>
+            <w:shd w:fill="1F4E79"/>
+          </w:tcPr>
+          <w:p>
+            <w:r>
+              <w:rPr>
+                <w:b/>
+                <w:color w:val="FFFFFF"/>
+                <w:sz w:val="20"/>
+              </w:rPr>
+              <w:t>Definition &amp; Rules</w:t>
+            </w:r>
+          </w:p>
+        </w:tc>
+        <w:tc>
+          <w:tcPr>
+            <w:tcW w:type="dxa" w:w="2160"/>
+            <w:shd w:fill="1F4E79"/>
+          </w:tcPr>
+          <w:p>
+            <w:r>
+              <w:rPr>
+                <w:b/>
+                <w:color w:val="FFFFFF"/>
+                <w:sz w:val="20"/>
+              </w:rPr>
+              <w:t>Example</w:t>
+            </w:r>
+          </w:p>
+        </w:tc>
+      </w:tr>
+      <w:tr>
+        <w:tc>
+          <w:tcPr>
+            <w:tcW w:type="dxa" w:w="2160"/>
+            <w:shd w:fill="D9E2F3"/>
+          </w:tcPr>
+          <w:p>
+            <w:r>
+              <w:rPr>
+                <w:sz w:val="20"/>
+              </w:rPr>
+              <w:t>study_id</w:t>
+            </w:r>
+          </w:p>
+        </w:tc>
+        <w:tc>
+          <w:tcPr>
+            <w:tcW w:type="dxa" w:w="2160"/>
+            <w:shd w:fill="D9E2F3"/>
+          </w:tcPr>
+          <w:p>
+            <w:r>
+              <w:rPr>
+                <w:sz w:val="20"/>
+              </w:rPr>
+              <w:t>Integer</w:t>
+            </w:r>
+          </w:p>
+        </w:tc>
+        <w:tc>
+          <w:tcPr>
+            <w:tcW w:type="dxa" w:w="2160"/>
+            <w:shd w:fill="D9E2F3"/>
+          </w:tcPr>
+          <w:p>
+            <w:r>
+              <w:rPr>
+                <w:sz w:val="20"/>
+              </w:rPr>
+              <w:t>Must match study_id in STUDY_CHAR and EFFECT_SIZES.</w:t>
+            </w:r>
+          </w:p>
+        </w:tc>
+        <w:tc>
+          <w:tcPr>
+            <w:tcW w:type="dxa" w:w="2160"/>
+            <w:shd w:fill="D9E2F3"/>
+          </w:tcPr>
+          <w:p>
+            <w:r>
+              <w:rPr>
+                <w:sz w:val="20"/>
+              </w:rPr>
+              <w:t>1</w:t>
+            </w:r>
+          </w:p>
+        </w:tc>
+      </w:tr>
+      <w:tr>
+        <w:tc>
+          <w:tcPr>
+            <w:tcW w:type="dxa" w:w="2160"/>
+          </w:tcPr>
+          <w:p>
+            <w:r>
+              <w:rPr>
+                <w:sz w:val="20"/>
+              </w:rPr>
+              <w:t>es_id</w:t>
+            </w:r>
+          </w:p>
+        </w:tc>
+        <w:tc>
+          <w:tcPr>
+            <w:tcW w:type="dxa" w:w="2160"/>
+          </w:tcPr>
+          <w:p>
+            <w:r>
+              <w:rPr>
+                <w:sz w:val="20"/>
+              </w:rPr>
+              <w:t>String</w:t>
+            </w:r>
+          </w:p>
+        </w:tc>
+        <w:tc>
+          <w:tcPr>
+            <w:tcW w:type="dxa" w:w="2160"/>
+          </w:tcPr>
+          <w:p>
+            <w:r>
+              <w:rPr>
+                <w:sz w:val="20"/>
+              </w:rPr>
+              <w:t>Must match es_id in EFFECT_SIZES. Links this extraction to a specific effect size.</w:t>
+            </w:r>
+          </w:p>
+        </w:tc>
+        <w:tc>
+          <w:tcPr>
+            <w:tcW w:type="dxa" w:w="2160"/>
+          </w:tcPr>
+          <w:p>
+            <w:r>
+              <w:rPr>
+                <w:sz w:val="20"/>
+              </w:rPr>
+              <w:t>S001_E01</w:t>
+            </w:r>
+          </w:p>
+        </w:tc>
+      </w:tr>
+      <w:tr>
+        <w:tc>
+          <w:tcPr>
+            <w:tcW w:type="dxa" w:w="2160"/>
+            <w:shd w:fill="D9E2F3"/>
+          </w:tcPr>
+          <w:p>
+            <w:r>
+              <w:rPr>
+                <w:sz w:val="20"/>
+              </w:rPr>
+              <w:t>extraction_id</w:t>
+            </w:r>
+          </w:p>
+        </w:tc>
+        <w:tc>
+          <w:tcPr>
+            <w:tcW w:type="dxa" w:w="2160"/>
+            <w:shd w:fill="D9E2F3"/>
+          </w:tcPr>
+          <w:p>
+            <w:r>
+              <w:rPr>
+                <w:sz w:val="20"/>
+              </w:rPr>
+              <w:t>String</w:t>
+            </w:r>
+          </w:p>
+        </w:tc>
+        <w:tc>
+          <w:tcPr>
+            <w:tcW w:type="dxa" w:w="2160"/>
+            <w:shd w:fill="D9E2F3"/>
+          </w:tcPr>
+          <w:p>
+            <w:r>
+              <w:rPr>
+                <w:sz w:val="20"/>
+              </w:rPr>
+              <w:t>Unique ID for each extracted value. Format: S###_E##_X## (e.g., S001_E01_X01). Sequential within each effect size.</w:t>
+            </w:r>
+          </w:p>
+        </w:tc>
+        <w:tc>
+          <w:tcPr>
+            <w:tcW w:type="dxa" w:w="2160"/>
+            <w:shd w:fill="D9E2F3"/>
+          </w:tcPr>
+          <w:p>
+            <w:r>
+              <w:rPr>
+                <w:sz w:val="20"/>
+              </w:rPr>
+              <w:t>S001_E01_X01</w:t>
+            </w:r>
+          </w:p>
+        </w:tc>
+      </w:tr>
+      <w:tr>
+        <w:tc>
+          <w:tcPr>
+            <w:tcW w:type="dxa" w:w="2160"/>
+          </w:tcPr>
+          <w:p>
+            <w:r>
+              <w:rPr>
+                <w:sz w:val="20"/>
+              </w:rPr>
+              <w:t>page_number</w:t>
+            </w:r>
+          </w:p>
+        </w:tc>
+        <w:tc>
+          <w:tcPr>
+            <w:tcW w:type="dxa" w:w="2160"/>
+          </w:tcPr>
+          <w:p>
+            <w:r>
+              <w:rPr>
+                <w:sz w:val="20"/>
+              </w:rPr>
+              <w:t>Integer</w:t>
+            </w:r>
+          </w:p>
+        </w:tc>
+        <w:tc>
+          <w:tcPr>
+            <w:tcW w:type="dxa" w:w="2160"/>
+          </w:tcPr>
+          <w:p>
+            <w:r>
+              <w:rPr>
+                <w:sz w:val="20"/>
+              </w:rPr>
+              <w:t>PDF page number where the value appears.</w:t>
+            </w:r>
+          </w:p>
+        </w:tc>
+        <w:tc>
+          <w:tcPr>
+            <w:tcW w:type="dxa" w:w="2160"/>
+          </w:tcPr>
+          <w:p>
+            <w:r>
+              <w:rPr>
+                <w:sz w:val="20"/>
+              </w:rPr>
+              <w:t>12</w:t>
+            </w:r>
+          </w:p>
+        </w:tc>
+      </w:tr>
+      <w:tr>
+        <w:tc>
+          <w:tcPr>
+            <w:tcW w:type="dxa" w:w="2160"/>
+            <w:shd w:fill="D9E2F3"/>
+          </w:tcPr>
+          <w:p>
+            <w:r>
+              <w:rPr>
+                <w:sz w:val="20"/>
+              </w:rPr>
+              <w:t>table_or_figure</w:t>
+            </w:r>
+          </w:p>
+        </w:tc>
+        <w:tc>
+          <w:tcPr>
+            <w:tcW w:type="dxa" w:w="2160"/>
+            <w:shd w:fill="D9E2F3"/>
+          </w:tcPr>
+          <w:p>
+            <w:r>
+              <w:rPr>
+                <w:sz w:val="20"/>
+              </w:rPr>
+              <w:t>String</w:t>
+            </w:r>
+          </w:p>
+        </w:tc>
+        <w:tc>
+          <w:tcPr>
+            <w:tcW w:type="dxa" w:w="2160"/>
+            <w:shd w:fill="D9E2F3"/>
+          </w:tcPr>
+          <w:p>
+            <w:r>
+              <w:rPr>
+                <w:sz w:val="20"/>
+              </w:rPr>
+              <w:t>Specific table, figure, or text location (e.g., 'Table 3', 'Figure 2', 'text', 'supplementary'). Free text — no restricted values.</w:t>
+            </w:r>
+          </w:p>
+        </w:tc>
+        <w:tc>
+          <w:tcPr>
+            <w:tcW w:type="dxa" w:w="2160"/>
+            <w:shd w:fill="D9E2F3"/>
+          </w:tcPr>
+          <w:p>
+            <w:r>
+              <w:rPr>
+                <w:sz w:val="20"/>
+              </w:rPr>
+              <w:t>Table 3</w:t>
+            </w:r>
+          </w:p>
+        </w:tc>
+      </w:tr>
+      <w:tr>
+        <w:tc>
+          <w:tcPr>
+            <w:tcW w:type="dxa" w:w="2160"/>
+          </w:tcPr>
+          <w:p>
+            <w:r>
+              <w:rPr>
+                <w:sz w:val="20"/>
+              </w:rPr>
+              <w:t>section</w:t>
+            </w:r>
+          </w:p>
+        </w:tc>
+        <w:tc>
+          <w:tcPr>
+            <w:tcW w:type="dxa" w:w="2160"/>
+          </w:tcPr>
+          <w:p>
+            <w:r>
+              <w:rPr>
+                <w:sz w:val="20"/>
+              </w:rPr>
+              <w:t>Categorical</w:t>
+            </w:r>
+          </w:p>
+        </w:tc>
+        <w:tc>
+          <w:tcPr>
+            <w:tcW w:type="dxa" w:w="2160"/>
+          </w:tcPr>
+          <w:p>
+            <w:r>
+              <w:rPr>
+                <w:sz w:val="20"/>
+              </w:rPr>
+              <w:t>results | discussion | appendix. Section of the paper where value was found.</w:t>
+            </w:r>
+          </w:p>
+        </w:tc>
+        <w:tc>
+          <w:tcPr>
+            <w:tcW w:type="dxa" w:w="2160"/>
+          </w:tcPr>
+          <w:p>
+            <w:r>
+              <w:rPr>
+                <w:sz w:val="20"/>
+              </w:rPr>
+              <w:t>results</w:t>
+            </w:r>
+          </w:p>
+        </w:tc>
+      </w:tr>
+      <w:tr>
+        <w:tc>
+          <w:tcPr>
+            <w:tcW w:type="dxa" w:w="2160"/>
+            <w:shd w:fill="D9E2F3"/>
+          </w:tcPr>
+          <w:p>
+            <w:r>
+              <w:rPr>
+                <w:sz w:val="20"/>
+              </w:rPr>
+              <w:t>exact_quote</w:t>
+            </w:r>
+          </w:p>
+        </w:tc>
+        <w:tc>
+          <w:tcPr>
+            <w:tcW w:type="dxa" w:w="2160"/>
+            <w:shd w:fill="D9E2F3"/>
+          </w:tcPr>
+          <w:p>
+            <w:r>
+              <w:rPr>
+                <w:sz w:val="20"/>
+              </w:rPr>
+              <w:t>String</w:t>
+            </w:r>
+          </w:p>
+        </w:tc>
+        <w:tc>
+          <w:tcPr>
+            <w:tcW w:type="dxa" w:w="2160"/>
+            <w:shd w:fill="D9E2F3"/>
+          </w:tcPr>
+          <w:p>
+            <w:r>
+              <w:rPr>
+                <w:sz w:val="20"/>
+              </w:rPr>
+              <w:t>Copy the sentence or cell containing the value verbatim. Include surrounding context for clarity.</w:t>
+            </w:r>
+          </w:p>
+        </w:tc>
+        <w:tc>
+          <w:tcPr>
+            <w:tcW w:type="dxa" w:w="2160"/>
+            <w:shd w:fill="D9E2F3"/>
+          </w:tcPr>
+          <w:p>
+            <w:r>
+              <w:rPr>
+                <w:sz w:val="20"/>
+              </w:rPr>
+              <w:t>M = 82.3, SD = 11.5, n = 45</w:t>
+            </w:r>
+          </w:p>
+        </w:tc>
+      </w:tr>
+      <w:tr>
+        <w:tc>
+          <w:tcPr>
+            <w:tcW w:type="dxa" w:w="2160"/>
+          </w:tcPr>
+          <w:p>
+            <w:r>
+              <w:rPr>
+                <w:sz w:val="20"/>
+              </w:rPr>
+              <w:t>variable_extracted</w:t>
+            </w:r>
+          </w:p>
+        </w:tc>
+        <w:tc>
+          <w:tcPr>
+            <w:tcW w:type="dxa" w:w="2160"/>
+          </w:tcPr>
+          <w:p>
+            <w:r>
+              <w:rPr>
+                <w:sz w:val="20"/>
+              </w:rPr>
+              <w:t>String</w:t>
+            </w:r>
+          </w:p>
+        </w:tc>
+        <w:tc>
+          <w:tcPr>
+            <w:tcW w:type="dxa" w:w="2160"/>
+          </w:tcPr>
+          <w:p>
+            <w:r>
+              <w:rPr>
+                <w:sz w:val="20"/>
+              </w:rPr>
+              <w:t>Name of the EFFECT_SIZES variable this value maps to (e.g., 'm_treatment_post', 'sd_control_post').</w:t>
+            </w:r>
+          </w:p>
+        </w:tc>
+        <w:tc>
+          <w:tcPr>
+            <w:tcW w:type="dxa" w:w="2160"/>
+          </w:tcPr>
+          <w:p>
+            <w:r>
+              <w:rPr>
+                <w:sz w:val="20"/>
+              </w:rPr>
+              <w:t>m_treatment_post</w:t>
+            </w:r>
+          </w:p>
+        </w:tc>
+      </w:tr>
+      <w:tr>
+        <w:tc>
+          <w:tcPr>
+            <w:tcW w:type="dxa" w:w="2160"/>
+            <w:shd w:fill="D9E2F3"/>
+          </w:tcPr>
+          <w:p>
+            <w:r>
+              <w:rPr>
+                <w:sz w:val="20"/>
+              </w:rPr>
+              <w:t>value</w:t>
+            </w:r>
+          </w:p>
+        </w:tc>
+        <w:tc>
+          <w:tcPr>
+            <w:tcW w:type="dxa" w:w="2160"/>
+            <w:shd w:fill="D9E2F3"/>
+          </w:tcPr>
+          <w:p>
+            <w:r>
+              <w:rPr>
+                <w:sz w:val="20"/>
+              </w:rPr>
+              <w:t>String</w:t>
+            </w:r>
+          </w:p>
+        </w:tc>
+        <w:tc>
+          <w:tcPr>
+            <w:tcW w:type="dxa" w:w="2160"/>
+            <w:shd w:fill="D9E2F3"/>
+          </w:tcPr>
+          <w:p>
+            <w:r>
+              <w:rPr>
+                <w:sz w:val="20"/>
+              </w:rPr>
+              <w:t>The extracted numeric or text value exactly as reported.</w:t>
+            </w:r>
+          </w:p>
+        </w:tc>
+        <w:tc>
+          <w:tcPr>
+            <w:tcW w:type="dxa" w:w="2160"/>
+            <w:shd w:fill="D9E2F3"/>
+          </w:tcPr>
+          <w:p>
+            <w:r>
+              <w:rPr>
+                <w:sz w:val="20"/>
+              </w:rPr>
+              <w:t>82.3</w:t>
+            </w:r>
+          </w:p>
+        </w:tc>
+      </w:tr>
+      <w:tr>
+        <w:tc>
+          <w:tcPr>
+            <w:tcW w:type="dxa" w:w="2160"/>
+          </w:tcPr>
+          <w:p>
+            <w:r>
+              <w:rPr>
+                <w:sz w:val="20"/>
+              </w:rPr>
+              <w:t>unit_or_scale</w:t>
+            </w:r>
+          </w:p>
+        </w:tc>
+        <w:tc>
+          <w:tcPr>
+            <w:tcW w:type="dxa" w:w="2160"/>
+          </w:tcPr>
+          <w:p>
+            <w:r>
+              <w:rPr>
+                <w:sz w:val="20"/>
+              </w:rPr>
+              <w:t>String</w:t>
+            </w:r>
+          </w:p>
+        </w:tc>
+        <w:tc>
+          <w:tcPr>
+            <w:tcW w:type="dxa" w:w="2160"/>
+          </w:tcPr>
+          <w:p>
+            <w:r>
+              <w:rPr>
+                <w:sz w:val="20"/>
+              </w:rPr>
+              <w:t>Unit of measurement or scale range (e.g., '0-100', 'Likert 1-5', 'seconds').</w:t>
+            </w:r>
+          </w:p>
+        </w:tc>
+        <w:tc>
+          <w:tcPr>
+            <w:tcW w:type="dxa" w:w="2160"/>
+          </w:tcPr>
+          <w:p>
+            <w:r>
+              <w:rPr>
+                <w:sz w:val="20"/>
+              </w:rPr>
+              <w:t>0-100</w:t>
+            </w:r>
+          </w:p>
+        </w:tc>
+      </w:tr>
+      <w:tr>
+        <w:tc>
+          <w:tcPr>
+            <w:tcW w:type="dxa" w:w="2160"/>
+            <w:shd w:fill="D9E2F3"/>
+          </w:tcPr>
+          <w:p>
+            <w:r>
+              <w:rPr>
+                <w:sz w:val="20"/>
+              </w:rPr>
+              <w:t>extraction_confidence</w:t>
+            </w:r>
+          </w:p>
+        </w:tc>
+        <w:tc>
+          <w:tcPr>
+            <w:tcW w:type="dxa" w:w="2160"/>
+            <w:shd w:fill="D9E2F3"/>
+          </w:tcPr>
+          <w:p>
+            <w:r>
+              <w:rPr>
+                <w:sz w:val="20"/>
+              </w:rPr>
+              <w:t>Categorical</w:t>
+            </w:r>
+          </w:p>
+        </w:tc>
+        <w:tc>
+          <w:tcPr>
+            <w:tcW w:type="dxa" w:w="2160"/>
+            <w:shd w:fill="D9E2F3"/>
+          </w:tcPr>
+          <w:p>
+            <w:r>
+              <w:rPr>
+                <w:sz w:val="20"/>
+              </w:rPr>
+              <w:t>high | medium | low. See confidence definitions in 7.2.</w:t>
+            </w:r>
+          </w:p>
+        </w:tc>
+        <w:tc>
+          <w:tcPr>
+            <w:tcW w:type="dxa" w:w="2160"/>
+            <w:shd w:fill="D9E2F3"/>
+          </w:tcPr>
+          <w:p>
+            <w:r>
+              <w:rPr>
+                <w:sz w:val="20"/>
+              </w:rPr>
+              <w:t>high</w:t>
+            </w:r>
+          </w:p>
+        </w:tc>
+      </w:tr>
+      <w:tr>
+        <w:tc>
+          <w:tcPr>
+            <w:tcW w:type="dxa" w:w="2160"/>
+          </w:tcPr>
+          <w:p>
+            <w:r>
+              <w:rPr>
+                <w:sz w:val="20"/>
+              </w:rPr>
+              <w:t>confidence_notes</w:t>
+            </w:r>
+          </w:p>
+        </w:tc>
+        <w:tc>
+          <w:tcPr>
+            <w:tcW w:type="dxa" w:w="2160"/>
+          </w:tcPr>
+          <w:p>
+            <w:r>
+              <w:rPr>
+                <w:sz w:val="20"/>
+              </w:rPr>
+              <w:t>String</w:t>
+            </w:r>
+          </w:p>
+        </w:tc>
+        <w:tc>
+          <w:tcPr>
+            <w:tcW w:type="dxa" w:w="2160"/>
+          </w:tcPr>
+          <w:p>
+            <w:r>
+              <w:rPr>
+                <w:sz w:val="20"/>
+              </w:rPr>
+              <w:t>Explanation if confidence is medium or low. Blank if high.</w:t>
+            </w:r>
+          </w:p>
+        </w:tc>
+        <w:tc>
+          <w:tcPr>
+            <w:tcW w:type="dxa" w:w="2160"/>
+          </w:tcPr>
+          <w:p>
+            <w:r>
+              <w:rPr>
+                <w:sz w:val="20"/>
+              </w:rPr>
+            </w:r>
+          </w:p>
+        </w:tc>
+      </w:tr>
+    </w:tbl>
+    <w:p>
+      <w:pPr>
+        <w:pStyle w:val="Heading2"/>
+      </w:pPr>
+      <w:r>
+        <w:t>7.2 Documentation Guidelines</w:t>
       </w:r>
     </w:p>
     <w:p>
@@ -5301,7 +8837,7 @@
         <w:ind w:left="720"/>
       </w:pPr>
       <w:r>
-        <w:t>page_number: The PDF page where the value appears.</w:t>
+        <w:t>Create one row per extracted statistic. A single effect size typically has 4–8 rows (M, SD, n for each group).</w:t>
       </w:r>
     </w:p>
     <w:p>
@@ -5310,16 +8846,7 @@
         <w:ind w:left="720"/>
       </w:pPr>
       <w:r>
-        <w:t>table_or_figure: Identify the specific table/figure (e.g., 'Table 3', 'Figure 2', 'text').</w:t>
-      </w:r>
-    </w:p>
-    <w:p>
-      <w:pPr>
-        <w:pStyle w:val="ListBullet"/>
-        <w:ind w:left="720"/>
-      </w:pPr>
-      <w:r>
-        <w:t>section: Which section of the paper (results, discussion, appendix).</w:t>
+        <w:t>variable_extracted must exactly match a column name in EFFECT_SIZES (e.g., 'm_treatment_post', not 'treatment mean').</w:t>
       </w:r>
     </w:p>
     <w:p>
@@ -7745,7 +11272,1138 @@
         <w:pStyle w:val="Heading1"/>
       </w:pPr>
       <w:r>
-        <w:t>12. Quality Assurance Checklist</w:t>
+        <w:t>12. Study Exclusion Protocol</w:t>
+      </w:r>
+    </w:p>
+    <w:p>
+      <w:r>
+        <w:t>This section corresponds to Sheet 8: EXCLUSION_LOG. Every study examined at full-text screening or later that is NOT included in the final dataset must be documented here with the reason for exclusion. This is required for the PRISMA flow diagram.</w:t>
+      </w:r>
+    </w:p>
+    <w:p>
+      <w:pPr>
+        <w:pStyle w:val="Heading2"/>
+      </w:pPr>
+      <w:r>
+        <w:t>12.1 Complete Variable Reference (10 variables)</w:t>
+      </w:r>
+    </w:p>
+    <w:tbl>
+      <w:tblPr>
+        <w:tblW w:type="auto" w:w="0"/>
+        <w:jc w:val="center"/>
+        <w:tblLook w:firstColumn="1" w:firstRow="1" w:lastColumn="0" w:lastRow="0" w:noHBand="0" w:noVBand="1" w:val="04A0"/>
+      </w:tblPr>
+      <w:tblGrid>
+        <w:gridCol w:w="2160"/>
+        <w:gridCol w:w="2160"/>
+        <w:gridCol w:w="2160"/>
+        <w:gridCol w:w="2160"/>
+      </w:tblGrid>
+      <w:tr>
+        <w:tc>
+          <w:tcPr>
+            <w:tcW w:type="dxa" w:w="2160"/>
+            <w:shd w:fill="1F4E79"/>
+          </w:tcPr>
+          <w:p>
+            <w:r>
+              <w:rPr>
+                <w:b/>
+                <w:color w:val="FFFFFF"/>
+                <w:sz w:val="20"/>
+              </w:rPr>
+              <w:t>Variable</w:t>
+            </w:r>
+          </w:p>
+        </w:tc>
+        <w:tc>
+          <w:tcPr>
+            <w:tcW w:type="dxa" w:w="2160"/>
+            <w:shd w:fill="1F4E79"/>
+          </w:tcPr>
+          <w:p>
+            <w:r>
+              <w:rPr>
+                <w:b/>
+                <w:color w:val="FFFFFF"/>
+                <w:sz w:val="20"/>
+              </w:rPr>
+              <w:t>Type</w:t>
+            </w:r>
+          </w:p>
+        </w:tc>
+        <w:tc>
+          <w:tcPr>
+            <w:tcW w:type="dxa" w:w="2160"/>
+            <w:shd w:fill="1F4E79"/>
+          </w:tcPr>
+          <w:p>
+            <w:r>
+              <w:rPr>
+                <w:b/>
+                <w:color w:val="FFFFFF"/>
+                <w:sz w:val="20"/>
+              </w:rPr>
+              <w:t>Definition &amp; Rules</w:t>
+            </w:r>
+          </w:p>
+        </w:tc>
+        <w:tc>
+          <w:tcPr>
+            <w:tcW w:type="dxa" w:w="2160"/>
+            <w:shd w:fill="1F4E79"/>
+          </w:tcPr>
+          <w:p>
+            <w:r>
+              <w:rPr>
+                <w:b/>
+                <w:color w:val="FFFFFF"/>
+                <w:sz w:val="20"/>
+              </w:rPr>
+              <w:t>Example</w:t>
+            </w:r>
+          </w:p>
+        </w:tc>
+      </w:tr>
+      <w:tr>
+        <w:tc>
+          <w:tcPr>
+            <w:tcW w:type="dxa" w:w="2160"/>
+            <w:shd w:fill="D9E2F3"/>
+          </w:tcPr>
+          <w:p>
+            <w:r>
+              <w:rPr>
+                <w:sz w:val="20"/>
+              </w:rPr>
+              <w:t>study_id</w:t>
+            </w:r>
+          </w:p>
+        </w:tc>
+        <w:tc>
+          <w:tcPr>
+            <w:tcW w:type="dxa" w:w="2160"/>
+            <w:shd w:fill="D9E2F3"/>
+          </w:tcPr>
+          <w:p>
+            <w:r>
+              <w:rPr>
+                <w:sz w:val="20"/>
+              </w:rPr>
+              <w:t>Integer</w:t>
+            </w:r>
+          </w:p>
+        </w:tc>
+        <w:tc>
+          <w:tcPr>
+            <w:tcW w:type="dxa" w:w="2160"/>
+            <w:shd w:fill="D9E2F3"/>
+          </w:tcPr>
+          <w:p>
+            <w:r>
+              <w:rPr>
+                <w:sz w:val="20"/>
+              </w:rPr>
+              <w:t>Sequential ID assigned during screening. Excluded studies retain their IDs (never reused).</w:t>
+            </w:r>
+          </w:p>
+        </w:tc>
+        <w:tc>
+          <w:tcPr>
+            <w:tcW w:type="dxa" w:w="2160"/>
+            <w:shd w:fill="D9E2F3"/>
+          </w:tcPr>
+          <w:p>
+            <w:r>
+              <w:rPr>
+                <w:sz w:val="20"/>
+              </w:rPr>
+              <w:t>15</w:t>
+            </w:r>
+          </w:p>
+        </w:tc>
+      </w:tr>
+      <w:tr>
+        <w:tc>
+          <w:tcPr>
+            <w:tcW w:type="dxa" w:w="2160"/>
+          </w:tcPr>
+          <w:p>
+            <w:r>
+              <w:rPr>
+                <w:sz w:val="20"/>
+              </w:rPr>
+              <w:t>first_author</w:t>
+            </w:r>
+          </w:p>
+        </w:tc>
+        <w:tc>
+          <w:tcPr>
+            <w:tcW w:type="dxa" w:w="2160"/>
+          </w:tcPr>
+          <w:p>
+            <w:r>
+              <w:rPr>
+                <w:sz w:val="20"/>
+              </w:rPr>
+              <w:t>String</w:t>
+            </w:r>
+          </w:p>
+        </w:tc>
+        <w:tc>
+          <w:tcPr>
+            <w:tcW w:type="dxa" w:w="2160"/>
+          </w:tcPr>
+          <w:p>
+            <w:r>
+              <w:rPr>
+                <w:sz w:val="20"/>
+              </w:rPr>
+              <w:t>Family name of first author.</w:t>
+            </w:r>
+          </w:p>
+        </w:tc>
+        <w:tc>
+          <w:tcPr>
+            <w:tcW w:type="dxa" w:w="2160"/>
+          </w:tcPr>
+          <w:p>
+            <w:r>
+              <w:rPr>
+                <w:sz w:val="20"/>
+              </w:rPr>
+              <w:t>Zhang</w:t>
+            </w:r>
+          </w:p>
+        </w:tc>
+      </w:tr>
+      <w:tr>
+        <w:tc>
+          <w:tcPr>
+            <w:tcW w:type="dxa" w:w="2160"/>
+            <w:shd w:fill="D9E2F3"/>
+          </w:tcPr>
+          <w:p>
+            <w:r>
+              <w:rPr>
+                <w:sz w:val="20"/>
+              </w:rPr>
+              <w:t>year</w:t>
+            </w:r>
+          </w:p>
+        </w:tc>
+        <w:tc>
+          <w:tcPr>
+            <w:tcW w:type="dxa" w:w="2160"/>
+            <w:shd w:fill="D9E2F3"/>
+          </w:tcPr>
+          <w:p>
+            <w:r>
+              <w:rPr>
+                <w:sz w:val="20"/>
+              </w:rPr>
+              <w:t>Integer</w:t>
+            </w:r>
+          </w:p>
+        </w:tc>
+        <w:tc>
+          <w:tcPr>
+            <w:tcW w:type="dxa" w:w="2160"/>
+            <w:shd w:fill="D9E2F3"/>
+          </w:tcPr>
+          <w:p>
+            <w:r>
+              <w:rPr>
+                <w:sz w:val="20"/>
+              </w:rPr>
+              <w:t>Publication year.</w:t>
+            </w:r>
+          </w:p>
+        </w:tc>
+        <w:tc>
+          <w:tcPr>
+            <w:tcW w:type="dxa" w:w="2160"/>
+            <w:shd w:fill="D9E2F3"/>
+          </w:tcPr>
+          <w:p>
+            <w:r>
+              <w:rPr>
+                <w:sz w:val="20"/>
+              </w:rPr>
+              <w:t>2024</w:t>
+            </w:r>
+          </w:p>
+        </w:tc>
+      </w:tr>
+      <w:tr>
+        <w:tc>
+          <w:tcPr>
+            <w:tcW w:type="dxa" w:w="2160"/>
+          </w:tcPr>
+          <w:p>
+            <w:r>
+              <w:rPr>
+                <w:sz w:val="20"/>
+              </w:rPr>
+              <w:t>title</w:t>
+            </w:r>
+          </w:p>
+        </w:tc>
+        <w:tc>
+          <w:tcPr>
+            <w:tcW w:type="dxa" w:w="2160"/>
+          </w:tcPr>
+          <w:p>
+            <w:r>
+              <w:rPr>
+                <w:sz w:val="20"/>
+              </w:rPr>
+              <w:t>String</w:t>
+            </w:r>
+          </w:p>
+        </w:tc>
+        <w:tc>
+          <w:tcPr>
+            <w:tcW w:type="dxa" w:w="2160"/>
+          </w:tcPr>
+          <w:p>
+            <w:r>
+              <w:rPr>
+                <w:sz w:val="20"/>
+              </w:rPr>
+              <w:t>Full title as published.</w:t>
+            </w:r>
+          </w:p>
+        </w:tc>
+        <w:tc>
+          <w:tcPr>
+            <w:tcW w:type="dxa" w:w="2160"/>
+          </w:tcPr>
+          <w:p>
+            <w:r>
+              <w:rPr>
+                <w:sz w:val="20"/>
+              </w:rPr>
+              <w:t>AI Tutoring in K-12...</w:t>
+            </w:r>
+          </w:p>
+        </w:tc>
+      </w:tr>
+      <w:tr>
+        <w:tc>
+          <w:tcPr>
+            <w:tcW w:type="dxa" w:w="2160"/>
+            <w:shd w:fill="D9E2F3"/>
+          </w:tcPr>
+          <w:p>
+            <w:r>
+              <w:rPr>
+                <w:sz w:val="20"/>
+              </w:rPr>
+              <w:t>exclusion_stage</w:t>
+            </w:r>
+          </w:p>
+        </w:tc>
+        <w:tc>
+          <w:tcPr>
+            <w:tcW w:type="dxa" w:w="2160"/>
+            <w:shd w:fill="D9E2F3"/>
+          </w:tcPr>
+          <w:p>
+            <w:r>
+              <w:rPr>
+                <w:sz w:val="20"/>
+              </w:rPr>
+              <w:t>Categorical</w:t>
+            </w:r>
+          </w:p>
+        </w:tc>
+        <w:tc>
+          <w:tcPr>
+            <w:tcW w:type="dxa" w:w="2160"/>
+            <w:shd w:fill="D9E2F3"/>
+          </w:tcPr>
+          <w:p>
+            <w:r>
+              <w:rPr>
+                <w:sz w:val="20"/>
+              </w:rPr>
+              <w:t>title_abstract: excluded during title/abstract screening. full_text: excluded after full-text review. post_coding: excluded after data extraction revealed problems.</w:t>
+            </w:r>
+          </w:p>
+        </w:tc>
+        <w:tc>
+          <w:tcPr>
+            <w:tcW w:type="dxa" w:w="2160"/>
+            <w:shd w:fill="D9E2F3"/>
+          </w:tcPr>
+          <w:p>
+            <w:r>
+              <w:rPr>
+                <w:sz w:val="20"/>
+              </w:rPr>
+              <w:t>full_text</w:t>
+            </w:r>
+          </w:p>
+        </w:tc>
+      </w:tr>
+      <w:tr>
+        <w:tc>
+          <w:tcPr>
+            <w:tcW w:type="dxa" w:w="2160"/>
+          </w:tcPr>
+          <w:p>
+            <w:r>
+              <w:rPr>
+                <w:sz w:val="20"/>
+              </w:rPr>
+              <w:t>exclusion_reason</w:t>
+            </w:r>
+          </w:p>
+        </w:tc>
+        <w:tc>
+          <w:tcPr>
+            <w:tcW w:type="dxa" w:w="2160"/>
+          </w:tcPr>
+          <w:p>
+            <w:r>
+              <w:rPr>
+                <w:sz w:val="20"/>
+              </w:rPr>
+              <w:t>Categorical</w:t>
+            </w:r>
+          </w:p>
+        </w:tc>
+        <w:tc>
+          <w:tcPr>
+            <w:tcW w:type="dxa" w:w="2160"/>
+          </w:tcPr>
+          <w:p>
+            <w:r>
+              <w:rPr>
+                <w:sz w:val="20"/>
+              </w:rPr>
+              <w:t>wrong_population | no_control | non_GenAI | insufficient_data | duplicate | not_peer_reviewed | wrong_design | other</w:t>
+            </w:r>
+          </w:p>
+        </w:tc>
+        <w:tc>
+          <w:tcPr>
+            <w:tcW w:type="dxa" w:w="2160"/>
+          </w:tcPr>
+          <w:p>
+            <w:r>
+              <w:rPr>
+                <w:sz w:val="20"/>
+              </w:rPr>
+              <w:t>wrong_population</w:t>
+            </w:r>
+          </w:p>
+        </w:tc>
+      </w:tr>
+      <w:tr>
+        <w:tc>
+          <w:tcPr>
+            <w:tcW w:type="dxa" w:w="2160"/>
+            <w:shd w:fill="D9E2F3"/>
+          </w:tcPr>
+          <w:p>
+            <w:r>
+              <w:rPr>
+                <w:sz w:val="20"/>
+              </w:rPr>
+              <w:t>detailed_rationale</w:t>
+            </w:r>
+          </w:p>
+        </w:tc>
+        <w:tc>
+          <w:tcPr>
+            <w:tcW w:type="dxa" w:w="2160"/>
+            <w:shd w:fill="D9E2F3"/>
+          </w:tcPr>
+          <w:p>
+            <w:r>
+              <w:rPr>
+                <w:sz w:val="20"/>
+              </w:rPr>
+              <w:t>String</w:t>
+            </w:r>
+          </w:p>
+        </w:tc>
+        <w:tc>
+          <w:tcPr>
+            <w:tcW w:type="dxa" w:w="2160"/>
+            <w:shd w:fill="D9E2F3"/>
+          </w:tcPr>
+          <w:p>
+            <w:r>
+              <w:rPr>
+                <w:sz w:val="20"/>
+              </w:rPr>
+              <w:t>Specific explanation. Be precise enough for another reviewer to verify.</w:t>
+            </w:r>
+          </w:p>
+        </w:tc>
+        <w:tc>
+          <w:tcPr>
+            <w:tcW w:type="dxa" w:w="2160"/>
+            <w:shd w:fill="D9E2F3"/>
+          </w:tcPr>
+          <w:p>
+            <w:r>
+              <w:rPr>
+                <w:sz w:val="20"/>
+              </w:rPr>
+              <w:t>Study conducted in high school (Grade 11), not higher education.</w:t>
+            </w:r>
+          </w:p>
+        </w:tc>
+      </w:tr>
+      <w:tr>
+        <w:tc>
+          <w:tcPr>
+            <w:tcW w:type="dxa" w:w="2160"/>
+          </w:tcPr>
+          <w:p>
+            <w:r>
+              <w:rPr>
+                <w:sz w:val="20"/>
+              </w:rPr>
+              <w:t>screener1_decision</w:t>
+            </w:r>
+          </w:p>
+        </w:tc>
+        <w:tc>
+          <w:tcPr>
+            <w:tcW w:type="dxa" w:w="2160"/>
+          </w:tcPr>
+          <w:p>
+            <w:r>
+              <w:rPr>
+                <w:sz w:val="20"/>
+              </w:rPr>
+              <w:t>Categorical</w:t>
+            </w:r>
+          </w:p>
+        </w:tc>
+        <w:tc>
+          <w:tcPr>
+            <w:tcW w:type="dxa" w:w="2160"/>
+          </w:tcPr>
+          <w:p>
+            <w:r>
+              <w:rPr>
+                <w:sz w:val="20"/>
+              </w:rPr>
+              <w:t>include | exclude | uncertain. Screener 1's independent decision.</w:t>
+            </w:r>
+          </w:p>
+        </w:tc>
+        <w:tc>
+          <w:tcPr>
+            <w:tcW w:type="dxa" w:w="2160"/>
+          </w:tcPr>
+          <w:p>
+            <w:r>
+              <w:rPr>
+                <w:sz w:val="20"/>
+              </w:rPr>
+              <w:t>exclude</w:t>
+            </w:r>
+          </w:p>
+        </w:tc>
+      </w:tr>
+      <w:tr>
+        <w:tc>
+          <w:tcPr>
+            <w:tcW w:type="dxa" w:w="2160"/>
+            <w:shd w:fill="D9E2F3"/>
+          </w:tcPr>
+          <w:p>
+            <w:r>
+              <w:rPr>
+                <w:sz w:val="20"/>
+              </w:rPr>
+              <w:t>screener2_decision</w:t>
+            </w:r>
+          </w:p>
+        </w:tc>
+        <w:tc>
+          <w:tcPr>
+            <w:tcW w:type="dxa" w:w="2160"/>
+            <w:shd w:fill="D9E2F3"/>
+          </w:tcPr>
+          <w:p>
+            <w:r>
+              <w:rPr>
+                <w:sz w:val="20"/>
+              </w:rPr>
+              <w:t>Categorical</w:t>
+            </w:r>
+          </w:p>
+        </w:tc>
+        <w:tc>
+          <w:tcPr>
+            <w:tcW w:type="dxa" w:w="2160"/>
+            <w:shd w:fill="D9E2F3"/>
+          </w:tcPr>
+          <w:p>
+            <w:r>
+              <w:rPr>
+                <w:sz w:val="20"/>
+              </w:rPr>
+              <w:t>include | exclude | uncertain. Screener 2's independent decision.</w:t>
+            </w:r>
+          </w:p>
+        </w:tc>
+        <w:tc>
+          <w:tcPr>
+            <w:tcW w:type="dxa" w:w="2160"/>
+            <w:shd w:fill="D9E2F3"/>
+          </w:tcPr>
+          <w:p>
+            <w:r>
+              <w:rPr>
+                <w:sz w:val="20"/>
+              </w:rPr>
+              <w:t>exclude</w:t>
+            </w:r>
+          </w:p>
+        </w:tc>
+      </w:tr>
+      <w:tr>
+        <w:tc>
+          <w:tcPr>
+            <w:tcW w:type="dxa" w:w="2160"/>
+          </w:tcPr>
+          <w:p>
+            <w:r>
+              <w:rPr>
+                <w:sz w:val="20"/>
+              </w:rPr>
+              <w:t>final_decision</w:t>
+            </w:r>
+          </w:p>
+        </w:tc>
+        <w:tc>
+          <w:tcPr>
+            <w:tcW w:type="dxa" w:w="2160"/>
+          </w:tcPr>
+          <w:p>
+            <w:r>
+              <w:rPr>
+                <w:sz w:val="20"/>
+              </w:rPr>
+              <w:t>Categorical</w:t>
+            </w:r>
+          </w:p>
+        </w:tc>
+        <w:tc>
+          <w:tcPr>
+            <w:tcW w:type="dxa" w:w="2160"/>
+          </w:tcPr>
+          <w:p>
+            <w:r>
+              <w:rPr>
+                <w:sz w:val="20"/>
+              </w:rPr>
+              <w:t>include | exclude. Final consensus decision after discussion.</w:t>
+            </w:r>
+          </w:p>
+        </w:tc>
+        <w:tc>
+          <w:tcPr>
+            <w:tcW w:type="dxa" w:w="2160"/>
+          </w:tcPr>
+          <w:p>
+            <w:r>
+              <w:rPr>
+                <w:sz w:val="20"/>
+              </w:rPr>
+              <w:t>exclude</w:t>
+            </w:r>
+          </w:p>
+        </w:tc>
+      </w:tr>
+    </w:tbl>
+    <w:p>
+      <w:pPr>
+        <w:pStyle w:val="Heading2"/>
+      </w:pPr>
+      <w:r>
+        <w:t>12.2 When to Log</w:t>
+      </w:r>
+    </w:p>
+    <w:p>
+      <w:pPr>
+        <w:pStyle w:val="ListBullet"/>
+        <w:ind w:left="720"/>
+      </w:pPr>
+      <w:r>
+        <w:t>Log ALL studies excluded at full-text screening (not title/abstract rejects unless sample tracked).</w:t>
+      </w:r>
+    </w:p>
+    <w:p>
+      <w:pPr>
+        <w:pStyle w:val="ListBullet"/>
+        <w:ind w:left="720"/>
+      </w:pPr>
+      <w:r>
+        <w:t>Log studies excluded post-coding (e.g., discovered insufficient data during extraction).</w:t>
+      </w:r>
+    </w:p>
+    <w:p>
+      <w:pPr>
+        <w:pStyle w:val="ListBullet"/>
+        <w:ind w:left="720"/>
+      </w:pPr>
+      <w:r>
+        <w:t>If screeners disagree (one 'include', one 'exclude'), record both decisions and resolve via discussion or third reviewer.</w:t>
+      </w:r>
+    </w:p>
+    <w:p>
+      <w:r>
+        <w:br w:type="page"/>
+      </w:r>
+    </w:p>
+    <w:p>
+      <w:pPr>
+        <w:pStyle w:val="Heading1"/>
+      </w:pPr>
+      <w:r>
+        <w:t>13. Database Search Protocol</w:t>
+      </w:r>
+    </w:p>
+    <w:p>
+      <w:r>
+        <w:t>This section corresponds to Sheet 9: SEARCH_LOG. Every database search must be documented for reproducibility, following PRISMA 2020 requirements (Page et al., 2021).</w:t>
+      </w:r>
+    </w:p>
+    <w:p>
+      <w:pPr>
+        <w:pStyle w:val="Heading2"/>
+      </w:pPr>
+      <w:r>
+        <w:t>13.1 Complete Variable Reference (5 variables)</w:t>
+      </w:r>
+    </w:p>
+    <w:tbl>
+      <w:tblPr>
+        <w:tblW w:type="auto" w:w="0"/>
+        <w:jc w:val="center"/>
+        <w:tblLook w:firstColumn="1" w:firstRow="1" w:lastColumn="0" w:lastRow="0" w:noHBand="0" w:noVBand="1" w:val="04A0"/>
+      </w:tblPr>
+      <w:tblGrid>
+        <w:gridCol w:w="2160"/>
+        <w:gridCol w:w="2160"/>
+        <w:gridCol w:w="2160"/>
+        <w:gridCol w:w="2160"/>
+      </w:tblGrid>
+      <w:tr>
+        <w:tc>
+          <w:tcPr>
+            <w:tcW w:type="dxa" w:w="2160"/>
+            <w:shd w:fill="1F4E79"/>
+          </w:tcPr>
+          <w:p>
+            <w:r>
+              <w:rPr>
+                <w:b/>
+                <w:color w:val="FFFFFF"/>
+                <w:sz w:val="20"/>
+              </w:rPr>
+              <w:t>Variable</w:t>
+            </w:r>
+          </w:p>
+        </w:tc>
+        <w:tc>
+          <w:tcPr>
+            <w:tcW w:type="dxa" w:w="2160"/>
+            <w:shd w:fill="1F4E79"/>
+          </w:tcPr>
+          <w:p>
+            <w:r>
+              <w:rPr>
+                <w:b/>
+                <w:color w:val="FFFFFF"/>
+                <w:sz w:val="20"/>
+              </w:rPr>
+              <w:t>Type</w:t>
+            </w:r>
+          </w:p>
+        </w:tc>
+        <w:tc>
+          <w:tcPr>
+            <w:tcW w:type="dxa" w:w="2160"/>
+            <w:shd w:fill="1F4E79"/>
+          </w:tcPr>
+          <w:p>
+            <w:r>
+              <w:rPr>
+                <w:b/>
+                <w:color w:val="FFFFFF"/>
+                <w:sz w:val="20"/>
+              </w:rPr>
+              <w:t>Definition &amp; Rules</w:t>
+            </w:r>
+          </w:p>
+        </w:tc>
+        <w:tc>
+          <w:tcPr>
+            <w:tcW w:type="dxa" w:w="2160"/>
+            <w:shd w:fill="1F4E79"/>
+          </w:tcPr>
+          <w:p>
+            <w:r>
+              <w:rPr>
+                <w:b/>
+                <w:color w:val="FFFFFF"/>
+                <w:sz w:val="20"/>
+              </w:rPr>
+              <w:t>Example</w:t>
+            </w:r>
+          </w:p>
+        </w:tc>
+      </w:tr>
+      <w:tr>
+        <w:tc>
+          <w:tcPr>
+            <w:tcW w:type="dxa" w:w="2160"/>
+            <w:shd w:fill="D9E2F3"/>
+          </w:tcPr>
+          <w:p>
+            <w:r>
+              <w:rPr>
+                <w:sz w:val="20"/>
+              </w:rPr>
+              <w:t>database</w:t>
+            </w:r>
+          </w:p>
+        </w:tc>
+        <w:tc>
+          <w:tcPr>
+            <w:tcW w:type="dxa" w:w="2160"/>
+            <w:shd w:fill="D9E2F3"/>
+          </w:tcPr>
+          <w:p>
+            <w:r>
+              <w:rPr>
+                <w:sz w:val="20"/>
+              </w:rPr>
+              <w:t>String</w:t>
+            </w:r>
+          </w:p>
+        </w:tc>
+        <w:tc>
+          <w:tcPr>
+            <w:tcW w:type="dxa" w:w="2160"/>
+            <w:shd w:fill="D9E2F3"/>
+          </w:tcPr>
+          <w:p>
+            <w:r>
+              <w:rPr>
+                <w:sz w:val="20"/>
+              </w:rPr>
+              <w:t>Name of the database searched (e.g., PsycINFO, ERIC, Education Source, ProQuest, Semantic Scholar, OpenAlex, Web of Science).</w:t>
+            </w:r>
+          </w:p>
+        </w:tc>
+        <w:tc>
+          <w:tcPr>
+            <w:tcW w:type="dxa" w:w="2160"/>
+            <w:shd w:fill="D9E2F3"/>
+          </w:tcPr>
+          <w:p>
+            <w:r>
+              <w:rPr>
+                <w:sz w:val="20"/>
+              </w:rPr>
+              <w:t>ERIC</w:t>
+            </w:r>
+          </w:p>
+        </w:tc>
+      </w:tr>
+      <w:tr>
+        <w:tc>
+          <w:tcPr>
+            <w:tcW w:type="dxa" w:w="2160"/>
+          </w:tcPr>
+          <w:p>
+            <w:r>
+              <w:rPr>
+                <w:sz w:val="20"/>
+              </w:rPr>
+              <w:t>search_date</w:t>
+            </w:r>
+          </w:p>
+        </w:tc>
+        <w:tc>
+          <w:tcPr>
+            <w:tcW w:type="dxa" w:w="2160"/>
+          </w:tcPr>
+          <w:p>
+            <w:r>
+              <w:rPr>
+                <w:sz w:val="20"/>
+              </w:rPr>
+              <w:t>Date</w:t>
+            </w:r>
+          </w:p>
+        </w:tc>
+        <w:tc>
+          <w:tcPr>
+            <w:tcW w:type="dxa" w:w="2160"/>
+          </w:tcPr>
+          <w:p>
+            <w:r>
+              <w:rPr>
+                <w:sz w:val="20"/>
+              </w:rPr>
+              <w:t>Date the search was conducted (YYYY-MM-DD). Re-searches get new rows.</w:t>
+            </w:r>
+          </w:p>
+        </w:tc>
+        <w:tc>
+          <w:tcPr>
+            <w:tcW w:type="dxa" w:w="2160"/>
+          </w:tcPr>
+          <w:p>
+            <w:r>
+              <w:rPr>
+                <w:sz w:val="20"/>
+              </w:rPr>
+              <w:t>2026-02-10</w:t>
+            </w:r>
+          </w:p>
+        </w:tc>
+      </w:tr>
+      <w:tr>
+        <w:tc>
+          <w:tcPr>
+            <w:tcW w:type="dxa" w:w="2160"/>
+            <w:shd w:fill="D9E2F3"/>
+          </w:tcPr>
+          <w:p>
+            <w:r>
+              <w:rPr>
+                <w:sz w:val="20"/>
+              </w:rPr>
+              <w:t>search_string</w:t>
+            </w:r>
+          </w:p>
+        </w:tc>
+        <w:tc>
+          <w:tcPr>
+            <w:tcW w:type="dxa" w:w="2160"/>
+            <w:shd w:fill="D9E2F3"/>
+          </w:tcPr>
+          <w:p>
+            <w:r>
+              <w:rPr>
+                <w:sz w:val="20"/>
+              </w:rPr>
+              <w:t>String</w:t>
+            </w:r>
+          </w:p>
+        </w:tc>
+        <w:tc>
+          <w:tcPr>
+            <w:tcW w:type="dxa" w:w="2160"/>
+            <w:shd w:fill="D9E2F3"/>
+          </w:tcPr>
+          <w:p>
+            <w:r>
+              <w:rPr>
+                <w:sz w:val="20"/>
+              </w:rPr>
+              <w:t>Complete search query exactly as entered, including Boolean operators and field tags.</w:t>
+            </w:r>
+          </w:p>
+        </w:tc>
+        <w:tc>
+          <w:tcPr>
+            <w:tcW w:type="dxa" w:w="2160"/>
+            <w:shd w:fill="D9E2F3"/>
+          </w:tcPr>
+          <w:p>
+            <w:r>
+              <w:rPr>
+                <w:sz w:val="20"/>
+              </w:rPr>
+              <w:t>("generative AI" OR "ChatGPT" OR "GPT-4") AND "higher education"</w:t>
+            </w:r>
+          </w:p>
+        </w:tc>
+      </w:tr>
+      <w:tr>
+        <w:tc>
+          <w:tcPr>
+            <w:tcW w:type="dxa" w:w="2160"/>
+          </w:tcPr>
+          <w:p>
+            <w:r>
+              <w:rPr>
+                <w:sz w:val="20"/>
+              </w:rPr>
+              <w:t>results_count</w:t>
+            </w:r>
+          </w:p>
+        </w:tc>
+        <w:tc>
+          <w:tcPr>
+            <w:tcW w:type="dxa" w:w="2160"/>
+          </w:tcPr>
+          <w:p>
+            <w:r>
+              <w:rPr>
+                <w:sz w:val="20"/>
+              </w:rPr>
+              <w:t>Integer</w:t>
+            </w:r>
+          </w:p>
+        </w:tc>
+        <w:tc>
+          <w:tcPr>
+            <w:tcW w:type="dxa" w:w="2160"/>
+          </w:tcPr>
+          <w:p>
+            <w:r>
+              <w:rPr>
+                <w:sz w:val="20"/>
+              </w:rPr>
+              <w:t>Number of records returned by this search.</w:t>
+            </w:r>
+          </w:p>
+        </w:tc>
+        <w:tc>
+          <w:tcPr>
+            <w:tcW w:type="dxa" w:w="2160"/>
+          </w:tcPr>
+          <w:p>
+            <w:r>
+              <w:rPr>
+                <w:sz w:val="20"/>
+              </w:rPr>
+              <w:t>342</w:t>
+            </w:r>
+          </w:p>
+        </w:tc>
+      </w:tr>
+      <w:tr>
+        <w:tc>
+          <w:tcPr>
+            <w:tcW w:type="dxa" w:w="2160"/>
+            <w:shd w:fill="D9E2F3"/>
+          </w:tcPr>
+          <w:p>
+            <w:r>
+              <w:rPr>
+                <w:sz w:val="20"/>
+              </w:rPr>
+              <w:t>notes</w:t>
+            </w:r>
+          </w:p>
+        </w:tc>
+        <w:tc>
+          <w:tcPr>
+            <w:tcW w:type="dxa" w:w="2160"/>
+            <w:shd w:fill="D9E2F3"/>
+          </w:tcPr>
+          <w:p>
+            <w:r>
+              <w:rPr>
+                <w:sz w:val="20"/>
+              </w:rPr>
+              <w:t>String</w:t>
+            </w:r>
+          </w:p>
+        </w:tc>
+        <w:tc>
+          <w:tcPr>
+            <w:tcW w:type="dxa" w:w="2160"/>
+            <w:shd w:fill="D9E2F3"/>
+          </w:tcPr>
+          <w:p>
+            <w:r>
+              <w:rPr>
+                <w:sz w:val="20"/>
+              </w:rPr>
+              <w:t>Any relevant notes (e.g., filters applied, date range, search limitations).</w:t>
+            </w:r>
+          </w:p>
+        </w:tc>
+        <w:tc>
+          <w:tcPr>
+            <w:tcW w:type="dxa" w:w="2160"/>
+            <w:shd w:fill="D9E2F3"/>
+          </w:tcPr>
+          <w:p>
+            <w:r>
+              <w:rPr>
+                <w:sz w:val="20"/>
+              </w:rPr>
+              <w:t>Limited to 2023-2026, English only</w:t>
+            </w:r>
+          </w:p>
+        </w:tc>
+      </w:tr>
+    </w:tbl>
+    <w:p>
+      <w:pPr>
+        <w:pStyle w:val="Heading2"/>
+      </w:pPr>
+      <w:r>
+        <w:t>13.2 Search Documentation Requirements</w:t>
+      </w:r>
+    </w:p>
+    <w:p>
+      <w:pPr>
+        <w:pStyle w:val="ListBullet"/>
+        <w:ind w:left="720"/>
+      </w:pPr>
+      <w:r>
+        <w:t>Record one row per database per search date. If you search ERIC twice on different dates, create two rows.</w:t>
+      </w:r>
+    </w:p>
+    <w:p>
+      <w:pPr>
+        <w:pStyle w:val="ListBullet"/>
+        <w:ind w:left="720"/>
+      </w:pPr>
+      <w:r>
+        <w:t>Copy the exact search string — do not paraphrase or simplify.</w:t>
+      </w:r>
+    </w:p>
+    <w:p>
+      <w:pPr>
+        <w:pStyle w:val="ListBullet"/>
+        <w:ind w:left="720"/>
+      </w:pPr>
+      <w:r>
+        <w:t>Document any database-specific syntax (e.g., MeSH terms, ERIC descriptors).</w:t>
+      </w:r>
+    </w:p>
+    <w:p>
+      <w:pPr>
+        <w:pStyle w:val="ListBullet"/>
+        <w:ind w:left="720"/>
+      </w:pPr>
+      <w:r>
+        <w:t>If a database requires multiple searches (e.g., different field combinations), record each as a separate row.</w:t>
+      </w:r>
+    </w:p>
+    <w:p>
+      <w:r>
+        <w:br w:type="page"/>
+      </w:r>
+    </w:p>
+    <w:p>
+      <w:pPr>
+        <w:pStyle w:val="Heading1"/>
+      </w:pPr>
+      <w:r>
+        <w:t>14. Quality Assurance Checklist</w:t>
       </w:r>
     </w:p>
     <w:p>
@@ -7873,7 +12531,7 @@
         <w:pStyle w:val="Heading1"/>
       </w:pPr>
       <w:r>
-        <w:t>13. References</w:t>
+        <w:t>15. References</w:t>
       </w:r>
     </w:p>
     <w:p>

</xml_diff>